<commit_message>
Refresh report Git log appendix
Regenerate the Git log and Word report after the A2 hardening and documentation commits so the appendix reflects the submitted main branch.
</commit_message>
<xml_diff>
--- a/report/CS324_A2_Report.docx
+++ b/report/CS324_A2_Report.docx
@@ -2500,6 +2500,76 @@
       </w:pPr>
       <w:r>
         <w:t>Generated from the repository with git log --graph --date=short --pretty=format:'%h %ad %an%x09%s'. The initial commit imports the Assignment 1 code, and later commits add the gRPC migration, failover, quorum and the Assignment 2 hardening.</w:t>
+      </w:r>
+    </w:p>
+    <w:p>
+      <w:pPr>
+        <w:spacing w:after="0" w:before="0" w:line="240" w:lineRule="auto"/>
+      </w:pPr>
+      <w:r>
+        <w:rPr>
+          <w:rFonts w:ascii="Consolas" w:hAnsi="Consolas" w:eastAsia="Consolas"/>
+          <w:sz w:val="15"/>
+        </w:rPr>
+        <w:t>* 52739d0 2026-10-20 Surbhit Nand</w:t>
+        <w:tab/>
+        <w:t>Add submission-ready A2 Word report package</w:t>
+      </w:r>
+    </w:p>
+    <w:p>
+      <w:pPr>
+        <w:spacing w:after="0" w:before="0" w:line="240" w:lineRule="auto"/>
+      </w:pPr>
+      <w:r>
+        <w:rPr>
+          <w:rFonts w:ascii="Consolas" w:hAnsi="Consolas" w:eastAsia="Consolas"/>
+          <w:sz w:val="15"/>
+        </w:rPr>
+        <w:t>* 1a532c8 2026-10-20 Surbhit Nand</w:t>
+        <w:tab/>
+        <w:t>Document operational limits, leases and verification</w:t>
+      </w:r>
+    </w:p>
+    <w:p>
+      <w:pPr>
+        <w:spacing w:after="0" w:before="0" w:line="240" w:lineRule="auto"/>
+      </w:pPr>
+      <w:r>
+        <w:rPr>
+          <w:rFonts w:ascii="Consolas" w:hAnsi="Consolas" w:eastAsia="Consolas"/>
+          <w:sz w:val="15"/>
+        </w:rPr>
+        <w:t>* 9e88cec 2026-10-20 Surbhit Nand</w:t>
+        <w:tab/>
+        <w:t>Add CI, coverage and scale checks</w:t>
+      </w:r>
+    </w:p>
+    <w:p>
+      <w:pPr>
+        <w:spacing w:after="0" w:before="0" w:line="240" w:lineRule="auto"/>
+      </w:pPr>
+      <w:r>
+        <w:rPr>
+          <w:rFonts w:ascii="Consolas" w:hAnsi="Consolas" w:eastAsia="Consolas"/>
+          <w:sz w:val="15"/>
+        </w:rPr>
+        <w:t>* 15fa1fb 2026-10-20 Surbhit Nand</w:t>
+        <w:tab/>
+        <w:t>Bound coordinator retention and share gRPC channels</w:t>
+      </w:r>
+    </w:p>
+    <w:p>
+      <w:pPr>
+        <w:spacing w:after="0" w:before="0" w:line="240" w:lineRule="auto"/>
+      </w:pPr>
+      <w:r>
+        <w:rPr>
+          <w:rFonts w:ascii="Consolas" w:hAnsi="Consolas" w:eastAsia="Consolas"/>
+          <w:sz w:val="15"/>
+        </w:rPr>
+        <w:t>* 6eb9225 2026-10-20 Surbhit Nand</w:t>
+        <w:tab/>
+        <w:t>Harden bootstrap membership leases and persist ID counters</w:t>
       </w:r>
     </w:p>
     <w:p>

</xml_diff>

<commit_message>
Merge report feedback and add PDF export
</commit_message>
<xml_diff>
--- a/report/CS324_A2_Report.docx
+++ b/report/CS324_A2_Report.docx
@@ -27,6 +27,20 @@
           <w:sz w:val="76"/>
         </w:rPr>
         <w:t>Assignment 2</w:t>
+      </w:r>
+    </w:p>
+    <w:p>
+      <w:pPr>
+        <w:spacing w:after="160"/>
+        <w:jc w:val="center"/>
+      </w:pPr>
+      <w:r>
+        <w:rPr>
+          <w:b/>
+          <w:color w:val="2E5A88"/>
+          <w:sz w:val="34"/>
+        </w:rPr>
+        <w:t>Part 1: Report</w:t>
       </w:r>
     </w:p>
     <w:p>
@@ -773,265 +787,461 @@
         <w:pStyle w:val="Heading2"/>
       </w:pPr>
       <w:r>
-        <w:t>Contract and message fields</w:t>
+        <w:t>Service contract</w:t>
       </w:r>
     </w:p>
-    <w:tbl>
-      <w:tblPr>
-        <w:tblStyle w:val="TableGrid"/>
-        <w:tblW w:type="auto" w:w="0"/>
-        <w:jc w:val="center"/>
-        <w:tblLook w:firstColumn="1" w:firstRow="1" w:lastColumn="0" w:lastRow="0" w:noHBand="0" w:noVBand="1" w:val="04A0"/>
-      </w:tblPr>
-      <w:tblGrid>
-        <w:gridCol w:w="3168"/>
-        <w:gridCol w:w="3168"/>
-        <w:gridCol w:w="3168"/>
-      </w:tblGrid>
-      <w:tr>
-        <w:tc>
-          <w:tcPr>
-            <w:tcW w:type="dxa" w:w="2520"/>
-            <w:shd w:fill="D9E2F3"/>
-          </w:tcPr>
-          <w:p>
-            <w:pPr>
-              <w:spacing w:after="40"/>
-            </w:pPr>
-            <w:r/>
-            <w:r>
-              <w:rPr>
-                <w:rFonts w:ascii="Calibri" w:hAnsi="Calibri"/>
-                <w:b/>
-                <w:sz w:val="20"/>
-              </w:rPr>
-              <w:t>RPC / message</w:t>
-            </w:r>
-          </w:p>
-        </w:tc>
-        <w:tc>
-          <w:tcPr>
-            <w:tcW w:type="dxa" w:w="3672"/>
-            <w:shd w:fill="D9E2F3"/>
-          </w:tcPr>
-          <w:p>
-            <w:pPr>
-              <w:spacing w:after="40"/>
-            </w:pPr>
-            <w:r/>
-            <w:r>
-              <w:rPr>
-                <w:rFonts w:ascii="Calibri" w:hAnsi="Calibri"/>
-                <w:b/>
-                <w:sz w:val="20"/>
-              </w:rPr>
-              <w:t>Important fields</w:t>
-            </w:r>
-          </w:p>
-        </w:tc>
-        <w:tc>
-          <w:tcPr>
-            <w:tcW w:type="dxa" w:w="4104"/>
-            <w:shd w:fill="D9E2F3"/>
-          </w:tcPr>
-          <w:p>
-            <w:pPr>
-              <w:spacing w:after="40"/>
-            </w:pPr>
-            <w:r/>
-            <w:r>
-              <w:rPr>
-                <w:rFonts w:ascii="Calibri" w:hAnsi="Calibri"/>
-                <w:b/>
-                <w:sz w:val="20"/>
-              </w:rPr>
-              <w:t>Purpose</w:t>
-            </w:r>
-          </w:p>
-        </w:tc>
-      </w:tr>
-      <w:tr>
-        <w:tc>
-          <w:tcPr>
-            <w:tcW w:type="dxa" w:w="2520"/>
-          </w:tcPr>
-          <w:p>
-            <w:pPr>
-              <w:spacing w:after="40"/>
-            </w:pPr>
-            <w:r/>
-            <w:r>
-              <w:rPr>
-                <w:rFonts w:ascii="Calibri" w:hAnsi="Calibri"/>
-                <w:b w:val="0"/>
-                <w:sz w:val="20"/>
-              </w:rPr>
-              <w:t>SendElection(ElectionMessage)</w:t>
-            </w:r>
-          </w:p>
-        </w:tc>
-        <w:tc>
-          <w:tcPr>
-            <w:tcW w:type="dxa" w:w="3672"/>
-          </w:tcPr>
-          <w:p>
-            <w:pPr>
-              <w:spacing w:after="40"/>
-            </w:pPr>
-            <w:r/>
-            <w:r>
-              <w:rPr>
-                <w:rFonts w:ascii="Calibri" w:hAnsi="Calibri"/>
-                <w:b w:val="0"/>
-                <w:sz w:val="20"/>
-              </w:rPr>
-              <w:t>origin_id, candidate_id, candidate_jac, message_id, term, voters</w:t>
-            </w:r>
-          </w:p>
-        </w:tc>
-        <w:tc>
-          <w:tcPr>
-            <w:tcW w:type="dxa" w:w="4104"/>
-          </w:tcPr>
-          <w:p>
-            <w:pPr>
-              <w:spacing w:after="40"/>
-            </w:pPr>
-            <w:r/>
-            <w:r>
-              <w:rPr>
-                <w:rFonts w:ascii="Calibri" w:hAnsi="Calibri"/>
-                <w:b w:val="0"/>
-                <w:sz w:val="20"/>
-              </w:rPr>
-              <w:t>Forward the current best candidate around one wave.</w:t>
-            </w:r>
-          </w:p>
-        </w:tc>
-      </w:tr>
-      <w:tr>
-        <w:tc>
-          <w:tcPr>
-            <w:tcW w:type="dxa" w:w="2520"/>
-          </w:tcPr>
-          <w:p>
-            <w:pPr>
-              <w:spacing w:after="40"/>
-            </w:pPr>
-            <w:r/>
-            <w:r>
-              <w:rPr>
-                <w:rFonts w:ascii="Calibri" w:hAnsi="Calibri"/>
-                <w:b w:val="0"/>
-                <w:sz w:val="20"/>
-              </w:rPr>
-              <w:t>SendEcho(EchoMessage)</w:t>
-            </w:r>
-          </w:p>
-        </w:tc>
-        <w:tc>
-          <w:tcPr>
-            <w:tcW w:type="dxa" w:w="3672"/>
-          </w:tcPr>
-          <w:p>
-            <w:pPr>
-              <w:spacing w:after="40"/>
-            </w:pPr>
-            <w:r/>
-            <w:r>
-              <w:rPr>
-                <w:rFonts w:ascii="Calibri" w:hAnsi="Calibri"/>
-                <w:b w:val="0"/>
-                <w:sz w:val="20"/>
-              </w:rPr>
-              <w:t>message_id, from_worker_id, best_candidate_id, best_candidate_jac, term, voters</w:t>
-            </w:r>
-          </w:p>
-        </w:tc>
-        <w:tc>
-          <w:tcPr>
-            <w:tcW w:type="dxa" w:w="4104"/>
-          </w:tcPr>
-          <w:p>
-            <w:pPr>
-              <w:spacing w:after="40"/>
-            </w:pPr>
-            <w:r/>
-            <w:r>
-              <w:rPr>
-                <w:rFonts w:ascii="Calibri" w:hAnsi="Calibri"/>
-                <w:b w:val="0"/>
-                <w:sz w:val="20"/>
-              </w:rPr>
-              <w:t>Return a subtree's best candidate and participating voter set.</w:t>
-            </w:r>
-          </w:p>
-        </w:tc>
-      </w:tr>
-      <w:tr>
-        <w:tc>
-          <w:tcPr>
-            <w:tcW w:type="dxa" w:w="2520"/>
-          </w:tcPr>
-          <w:p>
-            <w:pPr>
-              <w:spacing w:after="40"/>
-            </w:pPr>
-            <w:r/>
-            <w:r>
-              <w:rPr>
-                <w:rFonts w:ascii="Calibri" w:hAnsi="Calibri"/>
-                <w:b w:val="0"/>
-                <w:sz w:val="20"/>
-              </w:rPr>
-              <w:t>AnnounceCoordinator(CoordinatorAnnouncement)</w:t>
-            </w:r>
-          </w:p>
-        </w:tc>
-        <w:tc>
-          <w:tcPr>
-            <w:tcW w:type="dxa" w:w="3672"/>
-          </w:tcPr>
-          <w:p>
-            <w:pPr>
-              <w:spacing w:after="40"/>
-            </w:pPr>
-            <w:r/>
-            <w:r>
-              <w:rPr>
-                <w:rFonts w:ascii="Calibri" w:hAnsi="Calibri"/>
-                <w:b w:val="0"/>
-                <w:sz w:val="20"/>
-              </w:rPr>
-              <w:t>coordinator_id, message_id, term</w:t>
-            </w:r>
-          </w:p>
-        </w:tc>
-        <w:tc>
-          <w:tcPr>
-            <w:tcW w:type="dxa" w:w="4104"/>
-          </w:tcPr>
-          <w:p>
-            <w:pPr>
-              <w:spacing w:after="40"/>
-            </w:pPr>
-            <w:r/>
-            <w:r>
-              <w:rPr>
-                <w:rFonts w:ascii="Calibri" w:hAnsi="Calibri"/>
-                <w:b w:val="0"/>
-                <w:sz w:val="20"/>
-              </w:rPr>
-              <w:t>Install a new (term, coordinator) view; duplicates are not relayed.</w:t>
-            </w:r>
-          </w:p>
-        </w:tc>
-      </w:tr>
-    </w:tbl>
     <w:p>
       <w:pPr>
-        <w:spacing w:after="40"/>
-      </w:pPr>
+        <w:spacing w:after="120"/>
+        <w:jc w:val="both"/>
+      </w:pPr>
+      <w:r>
+        <w:t>The frozen contract below is the only interface used for election traffic. Generated Java stubs are shared by bootstrap, worker, client and integration tests.</w:t>
+      </w:r>
+    </w:p>
+    <w:p>
+      <w:pPr>
+        <w:spacing w:after="0" w:before="0" w:line="240" w:lineRule="auto"/>
+      </w:pPr>
+      <w:r>
+        <w:rPr>
+          <w:rFonts w:ascii="Consolas" w:hAnsi="Consolas" w:eastAsia="Consolas"/>
+          <w:sz w:val="15"/>
+        </w:rPr>
+        <w:t>syntax = "proto3";</w:t>
+      </w:r>
+    </w:p>
+    <w:p>
+      <w:pPr>
+        <w:spacing w:after="0" w:before="0" w:line="240" w:lineRule="auto"/>
+      </w:pPr>
+      <w:r>
+        <w:rPr>
+          <w:rFonts w:ascii="Consolas" w:hAnsi="Consolas" w:eastAsia="Consolas"/>
+          <w:sz w:val="15"/>
+        </w:rPr>
+        <w:t>package distrilab;</w:t>
+      </w:r>
+    </w:p>
+    <w:p>
+      <w:pPr>
+        <w:spacing w:after="0" w:before="0" w:line="240" w:lineRule="auto"/>
+      </w:pPr>
+      <w:r>
+        <w:rPr>
+          <w:rFonts w:ascii="Consolas" w:hAnsi="Consolas" w:eastAsia="Consolas"/>
+          <w:sz w:val="15"/>
+        </w:rPr>
+        <w:t>option java_package = "com.cs324.election.proto";</w:t>
+      </w:r>
+    </w:p>
+    <w:p>
+      <w:pPr>
+        <w:spacing w:after="0" w:before="0" w:line="240" w:lineRule="auto"/>
+      </w:pPr>
+      <w:r>
+        <w:rPr>
+          <w:rFonts w:ascii="Consolas" w:hAnsi="Consolas" w:eastAsia="Consolas"/>
+          <w:sz w:val="15"/>
+        </w:rPr>
+        <w:t>option java_multiple_files = true;</w:t>
+      </w:r>
+    </w:p>
+    <w:p>
+      <w:pPr>
+        <w:spacing w:after="0" w:before="0" w:line="240" w:lineRule="auto"/>
+      </w:pPr>
+      <w:r>
+        <w:rPr>
+          <w:rFonts w:ascii="Consolas" w:hAnsi="Consolas" w:eastAsia="Consolas"/>
+          <w:sz w:val="15"/>
+        </w:rPr>
+        <w:t xml:space="preserve"> </w:t>
+      </w:r>
+    </w:p>
+    <w:p>
+      <w:pPr>
+        <w:spacing w:after="0" w:before="0" w:line="240" w:lineRule="auto"/>
+      </w:pPr>
+      <w:r>
+        <w:rPr>
+          <w:rFonts w:ascii="Consolas" w:hAnsi="Consolas" w:eastAsia="Consolas"/>
+          <w:sz w:val="15"/>
+        </w:rPr>
+        <w:t>service ElectionService {</w:t>
+      </w:r>
+    </w:p>
+    <w:p>
+      <w:pPr>
+        <w:spacing w:after="0" w:before="0" w:line="240" w:lineRule="auto"/>
+      </w:pPr>
+      <w:r>
+        <w:rPr>
+          <w:rFonts w:ascii="Consolas" w:hAnsi="Consolas" w:eastAsia="Consolas"/>
+          <w:sz w:val="15"/>
+        </w:rPr>
+        <w:t xml:space="preserve">  rpc SendElection(ElectionMessage) returns (ElectionAck);</w:t>
+      </w:r>
+    </w:p>
+    <w:p>
+      <w:pPr>
+        <w:spacing w:after="0" w:before="0" w:line="240" w:lineRule="auto"/>
+      </w:pPr>
+      <w:r>
+        <w:rPr>
+          <w:rFonts w:ascii="Consolas" w:hAnsi="Consolas" w:eastAsia="Consolas"/>
+          <w:sz w:val="15"/>
+        </w:rPr>
+        <w:t xml:space="preserve">  rpc SendEcho(EchoMessage) returns (EchoAck);</w:t>
+      </w:r>
+    </w:p>
+    <w:p>
+      <w:pPr>
+        <w:spacing w:after="0" w:before="0" w:line="240" w:lineRule="auto"/>
+      </w:pPr>
+      <w:r>
+        <w:rPr>
+          <w:rFonts w:ascii="Consolas" w:hAnsi="Consolas" w:eastAsia="Consolas"/>
+          <w:sz w:val="15"/>
+        </w:rPr>
+        <w:t xml:space="preserve">  rpc AnnounceCoordinator(CoordinatorAnnouncement) returns (CoordinatorAck);</w:t>
+      </w:r>
+    </w:p>
+    <w:p>
+      <w:pPr>
+        <w:spacing w:after="0" w:before="0" w:line="240" w:lineRule="auto"/>
+      </w:pPr>
+      <w:r>
+        <w:rPr>
+          <w:rFonts w:ascii="Consolas" w:hAnsi="Consolas" w:eastAsia="Consolas"/>
+          <w:sz w:val="15"/>
+        </w:rPr>
+        <w:t>}</w:t>
+      </w:r>
+    </w:p>
+    <w:p>
+      <w:pPr>
+        <w:spacing w:after="0" w:before="0" w:line="240" w:lineRule="auto"/>
+      </w:pPr>
+      <w:r>
+        <w:rPr>
+          <w:rFonts w:ascii="Consolas" w:hAnsi="Consolas" w:eastAsia="Consolas"/>
+          <w:sz w:val="15"/>
+        </w:rPr>
+        <w:t xml:space="preserve"> </w:t>
+      </w:r>
+    </w:p>
+    <w:p>
+      <w:pPr>
+        <w:spacing w:after="0" w:before="0" w:line="240" w:lineRule="auto"/>
+      </w:pPr>
+      <w:r>
+        <w:rPr>
+          <w:rFonts w:ascii="Consolas" w:hAnsi="Consolas" w:eastAsia="Consolas"/>
+          <w:sz w:val="15"/>
+        </w:rPr>
+        <w:t>message ElectionMessage {</w:t>
+      </w:r>
+    </w:p>
+    <w:p>
+      <w:pPr>
+        <w:spacing w:after="0" w:before="0" w:line="240" w:lineRule="auto"/>
+      </w:pPr>
+      <w:r>
+        <w:rPr>
+          <w:rFonts w:ascii="Consolas" w:hAnsi="Consolas" w:eastAsia="Consolas"/>
+          <w:sz w:val="15"/>
+        </w:rPr>
+        <w:t xml:space="preserve">  int32 origin_id = 1;</w:t>
+      </w:r>
+    </w:p>
+    <w:p>
+      <w:pPr>
+        <w:spacing w:after="0" w:before="0" w:line="240" w:lineRule="auto"/>
+      </w:pPr>
+      <w:r>
+        <w:rPr>
+          <w:rFonts w:ascii="Consolas" w:hAnsi="Consolas" w:eastAsia="Consolas"/>
+          <w:sz w:val="15"/>
+        </w:rPr>
+        <w:t xml:space="preserve">  int32 candidate_id = 2;</w:t>
+      </w:r>
+    </w:p>
+    <w:p>
+      <w:pPr>
+        <w:spacing w:after="0" w:before="0" w:line="240" w:lineRule="auto"/>
+      </w:pPr>
+      <w:r>
+        <w:rPr>
+          <w:rFonts w:ascii="Consolas" w:hAnsi="Consolas" w:eastAsia="Consolas"/>
+          <w:sz w:val="15"/>
+        </w:rPr>
+        <w:t xml:space="preserve">  int32 candidate_jac = 3;</w:t>
+      </w:r>
+    </w:p>
+    <w:p>
+      <w:pPr>
+        <w:spacing w:after="0" w:before="0" w:line="240" w:lineRule="auto"/>
+      </w:pPr>
+      <w:r>
+        <w:rPr>
+          <w:rFonts w:ascii="Consolas" w:hAnsi="Consolas" w:eastAsia="Consolas"/>
+          <w:sz w:val="15"/>
+        </w:rPr>
+        <w:t xml:space="preserve">  int64 message_id = 4;</w:t>
+      </w:r>
+    </w:p>
+    <w:p>
+      <w:pPr>
+        <w:spacing w:after="0" w:before="0" w:line="240" w:lineRule="auto"/>
+      </w:pPr>
+      <w:r>
+        <w:rPr>
+          <w:rFonts w:ascii="Consolas" w:hAnsi="Consolas" w:eastAsia="Consolas"/>
+          <w:sz w:val="15"/>
+        </w:rPr>
+        <w:t xml:space="preserve">  int64 term = 5;</w:t>
+      </w:r>
+    </w:p>
+    <w:p>
+      <w:pPr>
+        <w:spacing w:after="0" w:before="0" w:line="240" w:lineRule="auto"/>
+      </w:pPr>
+      <w:r>
+        <w:rPr>
+          <w:rFonts w:ascii="Consolas" w:hAnsi="Consolas" w:eastAsia="Consolas"/>
+          <w:sz w:val="15"/>
+        </w:rPr>
+        <w:t xml:space="preserve">  repeated int32 voters = 6;</w:t>
+      </w:r>
+    </w:p>
+    <w:p>
+      <w:pPr>
+        <w:spacing w:after="0" w:before="0" w:line="240" w:lineRule="auto"/>
+      </w:pPr>
+      <w:r>
+        <w:rPr>
+          <w:rFonts w:ascii="Consolas" w:hAnsi="Consolas" w:eastAsia="Consolas"/>
+          <w:sz w:val="15"/>
+        </w:rPr>
+        <w:t>}</w:t>
+      </w:r>
+    </w:p>
+    <w:p>
+      <w:pPr>
+        <w:spacing w:after="0" w:before="0" w:line="240" w:lineRule="auto"/>
+      </w:pPr>
+      <w:r>
+        <w:rPr>
+          <w:rFonts w:ascii="Consolas" w:hAnsi="Consolas" w:eastAsia="Consolas"/>
+          <w:sz w:val="15"/>
+        </w:rPr>
+        <w:t>message ElectionAck {}</w:t>
+      </w:r>
+    </w:p>
+    <w:p>
+      <w:pPr>
+        <w:spacing w:after="0" w:before="0" w:line="240" w:lineRule="auto"/>
+      </w:pPr>
+      <w:r>
+        <w:rPr>
+          <w:rFonts w:ascii="Consolas" w:hAnsi="Consolas" w:eastAsia="Consolas"/>
+          <w:sz w:val="15"/>
+        </w:rPr>
+        <w:t xml:space="preserve"> </w:t>
+      </w:r>
+    </w:p>
+    <w:p>
+      <w:pPr>
+        <w:spacing w:after="0" w:before="0" w:line="240" w:lineRule="auto"/>
+      </w:pPr>
+      <w:r>
+        <w:rPr>
+          <w:rFonts w:ascii="Consolas" w:hAnsi="Consolas" w:eastAsia="Consolas"/>
+          <w:sz w:val="15"/>
+        </w:rPr>
+        <w:t>message EchoMessage {</w:t>
+      </w:r>
+    </w:p>
+    <w:p>
+      <w:pPr>
+        <w:spacing w:after="0" w:before="0" w:line="240" w:lineRule="auto"/>
+      </w:pPr>
+      <w:r>
+        <w:rPr>
+          <w:rFonts w:ascii="Consolas" w:hAnsi="Consolas" w:eastAsia="Consolas"/>
+          <w:sz w:val="15"/>
+        </w:rPr>
+        <w:t xml:space="preserve">  int64 message_id = 1;</w:t>
+      </w:r>
+    </w:p>
+    <w:p>
+      <w:pPr>
+        <w:spacing w:after="0" w:before="0" w:line="240" w:lineRule="auto"/>
+      </w:pPr>
+      <w:r>
+        <w:rPr>
+          <w:rFonts w:ascii="Consolas" w:hAnsi="Consolas" w:eastAsia="Consolas"/>
+          <w:sz w:val="15"/>
+        </w:rPr>
+        <w:t xml:space="preserve">  int32 from_worker_id = 2;</w:t>
+      </w:r>
+    </w:p>
+    <w:p>
+      <w:pPr>
+        <w:spacing w:after="0" w:before="0" w:line="240" w:lineRule="auto"/>
+      </w:pPr>
+      <w:r>
+        <w:rPr>
+          <w:rFonts w:ascii="Consolas" w:hAnsi="Consolas" w:eastAsia="Consolas"/>
+          <w:sz w:val="15"/>
+        </w:rPr>
+        <w:t xml:space="preserve">  int32 best_candidate_id = 3;</w:t>
+      </w:r>
+    </w:p>
+    <w:p>
+      <w:pPr>
+        <w:spacing w:after="0" w:before="0" w:line="240" w:lineRule="auto"/>
+      </w:pPr>
+      <w:r>
+        <w:rPr>
+          <w:rFonts w:ascii="Consolas" w:hAnsi="Consolas" w:eastAsia="Consolas"/>
+          <w:sz w:val="15"/>
+        </w:rPr>
+        <w:t xml:space="preserve">  int32 best_candidate_jac = 4;</w:t>
+      </w:r>
+    </w:p>
+    <w:p>
+      <w:pPr>
+        <w:spacing w:after="0" w:before="0" w:line="240" w:lineRule="auto"/>
+      </w:pPr>
+      <w:r>
+        <w:rPr>
+          <w:rFonts w:ascii="Consolas" w:hAnsi="Consolas" w:eastAsia="Consolas"/>
+          <w:sz w:val="15"/>
+        </w:rPr>
+        <w:t xml:space="preserve">  int64 term = 5;</w:t>
+      </w:r>
+    </w:p>
+    <w:p>
+      <w:pPr>
+        <w:spacing w:after="0" w:before="0" w:line="240" w:lineRule="auto"/>
+      </w:pPr>
+      <w:r>
+        <w:rPr>
+          <w:rFonts w:ascii="Consolas" w:hAnsi="Consolas" w:eastAsia="Consolas"/>
+          <w:sz w:val="15"/>
+        </w:rPr>
+        <w:t xml:space="preserve">  repeated int32 voters = 6;</w:t>
+      </w:r>
+    </w:p>
+    <w:p>
+      <w:pPr>
+        <w:spacing w:after="0" w:before="0" w:line="240" w:lineRule="auto"/>
+      </w:pPr>
+      <w:r>
+        <w:rPr>
+          <w:rFonts w:ascii="Consolas" w:hAnsi="Consolas" w:eastAsia="Consolas"/>
+          <w:sz w:val="15"/>
+        </w:rPr>
+        <w:t>}</w:t>
+      </w:r>
+    </w:p>
+    <w:p>
+      <w:pPr>
+        <w:spacing w:after="0" w:before="0" w:line="240" w:lineRule="auto"/>
+      </w:pPr>
+      <w:r>
+        <w:rPr>
+          <w:rFonts w:ascii="Consolas" w:hAnsi="Consolas" w:eastAsia="Consolas"/>
+          <w:sz w:val="15"/>
+        </w:rPr>
+        <w:t>message EchoAck {}</w:t>
+      </w:r>
+    </w:p>
+    <w:p>
+      <w:pPr>
+        <w:spacing w:after="0" w:before="0" w:line="240" w:lineRule="auto"/>
+      </w:pPr>
+      <w:r>
+        <w:rPr>
+          <w:rFonts w:ascii="Consolas" w:hAnsi="Consolas" w:eastAsia="Consolas"/>
+          <w:sz w:val="15"/>
+        </w:rPr>
+        <w:t xml:space="preserve"> </w:t>
+      </w:r>
+    </w:p>
+    <w:p>
+      <w:pPr>
+        <w:spacing w:after="0" w:before="0" w:line="240" w:lineRule="auto"/>
+      </w:pPr>
+      <w:r>
+        <w:rPr>
+          <w:rFonts w:ascii="Consolas" w:hAnsi="Consolas" w:eastAsia="Consolas"/>
+          <w:sz w:val="15"/>
+        </w:rPr>
+        <w:t>message CoordinatorAnnouncement {</w:t>
+      </w:r>
+    </w:p>
+    <w:p>
+      <w:pPr>
+        <w:spacing w:after="0" w:before="0" w:line="240" w:lineRule="auto"/>
+      </w:pPr>
+      <w:r>
+        <w:rPr>
+          <w:rFonts w:ascii="Consolas" w:hAnsi="Consolas" w:eastAsia="Consolas"/>
+          <w:sz w:val="15"/>
+        </w:rPr>
+        <w:t xml:space="preserve">  int32 coordinator_id = 1;</w:t>
+      </w:r>
+    </w:p>
+    <w:p>
+      <w:pPr>
+        <w:spacing w:after="0" w:before="0" w:line="240" w:lineRule="auto"/>
+      </w:pPr>
+      <w:r>
+        <w:rPr>
+          <w:rFonts w:ascii="Consolas" w:hAnsi="Consolas" w:eastAsia="Consolas"/>
+          <w:sz w:val="15"/>
+        </w:rPr>
+        <w:t xml:space="preserve">  int64 message_id = 2;</w:t>
+      </w:r>
+    </w:p>
+    <w:p>
+      <w:pPr>
+        <w:spacing w:after="0" w:before="0" w:line="240" w:lineRule="auto"/>
+      </w:pPr>
+      <w:r>
+        <w:rPr>
+          <w:rFonts w:ascii="Consolas" w:hAnsi="Consolas" w:eastAsia="Consolas"/>
+          <w:sz w:val="15"/>
+        </w:rPr>
+        <w:t xml:space="preserve">  int64 term = 3;</w:t>
+      </w:r>
+    </w:p>
+    <w:p>
+      <w:pPr>
+        <w:spacing w:after="0" w:before="0" w:line="240" w:lineRule="auto"/>
+      </w:pPr>
+      <w:r>
+        <w:rPr>
+          <w:rFonts w:ascii="Consolas" w:hAnsi="Consolas" w:eastAsia="Consolas"/>
+          <w:sz w:val="15"/>
+        </w:rPr>
+        <w:t>}</w:t>
+      </w:r>
+    </w:p>
+    <w:p>
+      <w:pPr>
+        <w:spacing w:after="0" w:before="0" w:line="240" w:lineRule="auto"/>
+      </w:pPr>
+      <w:r>
+        <w:rPr>
+          <w:rFonts w:ascii="Consolas" w:hAnsi="Consolas" w:eastAsia="Consolas"/>
+          <w:sz w:val="15"/>
+        </w:rPr>
+        <w:t>message CoordinatorAck {}</w:t>
+      </w:r>
     </w:p>
     <w:p>
       <w:pPr>
@@ -1047,43 +1257,63 @@
         <w:pStyle w:val="Heading2"/>
       </w:pPr>
       <w:r>
-        <w:t>Protocol</w:t>
+        <w:t>Method responsibilities</w:t>
       </w:r>
     </w:p>
     <w:p>
       <w:pPr>
-        <w:pStyle w:val="ListBullet"/>
-        <w:spacing w:after="60"/>
+        <w:spacing w:after="120"/>
+        <w:jc w:val="both"/>
       </w:pPr>
       <w:r>
-        <w:t>A root votes for itself and sends a wave to every neighbour with candidate_jac equal to its job-allocation counter (JAC) and candidate_id equal to its worker ID.</w:t>
+        <w:rPr>
+          <w:b/>
+          <w:color w:val="2E5A88"/>
+        </w:rPr>
+        <w:t xml:space="preserve">SendElection. </w:t>
+      </w:r>
+      <w:r>
+        <w:t>The root votes for itself and sends its candidate to every neighbour. A receiver compares (JAC, worker ID), forwards the winning candidate to every neighbour except its parent, and records the voters it has seen. A duplicate message_id is not silently dropped: the receiver echoes the best candidate it already knows, so a cycle cannot leave a parent waiting forever.</w:t>
       </w:r>
     </w:p>
     <w:p>
       <w:pPr>
-        <w:pStyle w:val="ListBullet"/>
-        <w:spacing w:after="60"/>
+        <w:spacing w:after="120"/>
+        <w:jc w:val="both"/>
       </w:pPr>
       <w:r>
-        <w:t>A receiver compares its own (JAC, ID) with the incoming candidate. A lower JAC wins; if the JACs are equal, the higher worker ID wins. The receiver then forwards the winning candidate to every neighbour except its parent.</w:t>
+        <w:rPr>
+          <w:b/>
+          <w:color w:val="2E5A88"/>
+        </w:rPr>
+        <w:t xml:space="preserve">SendEcho. </w:t>
+      </w:r>
+      <w:r>
+        <w:t>When all pending children have answered, a node merges their best candidates and voter sets with its own and sends one echo to its parent. A per-wave lock prevents a duplicate echo from completing the same wave twice. The root therefore learns the winner and the full participating set without all-to-all communication.</w:t>
       </w:r>
     </w:p>
     <w:p>
       <w:pPr>
-        <w:pStyle w:val="ListBullet"/>
-        <w:spacing w:after="60"/>
+        <w:spacing w:after="120"/>
+        <w:jc w:val="both"/>
       </w:pPr>
       <w:r>
-        <w:t>A repeated message_id is not silently dropped. The receiver echoes the best candidate it already knows. Silence would leave a sender waiting forever when a cycle delivers the same wave twice.</w:t>
+        <w:rPr>
+          <w:b/>
+          <w:color w:val="2E5A88"/>
+        </w:rPr>
+        <w:t xml:space="preserve">AnnounceCoordinator. </w:t>
+      </w:r>
+      <w:r>
+        <w:t>The root announces only after the voter union is a strict majority of ready workers known through the bootstrap directory. Otherwise it records ELECTION_NO_QUORUM and announces nobody. The announcement carries a newer term; a worker accepts the (term, coordinator ID) pair once and rejects stale or termless announcements.</w:t>
       </w:r>
     </w:p>
     <w:p>
       <w:pPr>
-        <w:pStyle w:val="ListBullet"/>
-        <w:spacing w:after="60"/>
+        <w:pStyle w:val="Heading2"/>
       </w:pPr>
       <w:r>
-        <w:t>When all pending children have answered, a node echoes once to its parent. Echo merging and the pending-child set are protected by a per-wave lock, so a duplicate echo cannot complete a wave twice.</w:t>
+        <w:t>Election rule</w:t>
       </w:r>
     </w:p>
     <w:p>
@@ -1092,7 +1322,7 @@
         <w:spacing w:after="60"/>
       </w:pPr>
       <w:r>
-        <w:t>At the root, the wave is complete when no children remain. The root announces the winner only if the recognised voter set is a strict majority of the ready workers known through the bootstrap directory. Otherwise it records ELECTION_NO_QUORUM and announces nobody.</w:t>
+        <w:t>A lower job-allocation counter (JAC) wins; when JACs are equal, the higher worker ID wins. This preserves the Assignment 1 load-balancing metric instead of electing by ID alone.</w:t>
       </w:r>
     </w:p>
     <w:p>
@@ -1101,7 +1331,25 @@
         <w:spacing w:after="60"/>
       </w:pPr>
       <w:r>
-        <w:t>Announcements carry a term higher than the terms observed by the wave. A worker accepts a newer (term, coordinator ID) pair and rejects stale or termless announcements, so a deposed coordinator cannot reclaim leadership.</w:t>
+        <w:t>A root that cannot collect a strict majority never announces a coordinator, so a minority partition cannot install a leader by itself.</w:t>
+      </w:r>
+    </w:p>
+    <w:p>
+      <w:pPr>
+        <w:pStyle w:val="ListBullet"/>
+        <w:spacing w:after="60"/>
+      </w:pPr>
+      <w:r>
+        <w:t>After the winner is known, QuorumMonitor probes ready workers every second with a 600 ms deadline, renews a 2.5-second lease, and forces a step-down after two failed checks. A leader without a majority cannot accept new work, preventing split brain.</w:t>
+      </w:r>
+    </w:p>
+    <w:p>
+      <w:pPr>
+        <w:pStyle w:val="ListBullet"/>
+        <w:spacing w:after="60"/>
+      </w:pPr>
+      <w:r>
+        <w:t>Terms increase with each election and are attached to announcements, so a deposed coordinator cannot reclaim leadership with an old message.</w:t>
       </w:r>
     </w:p>
     <w:p>
@@ -1118,7 +1366,7 @@
         <w:jc w:val="both"/>
       </w:pPr>
       <w:r>
-        <w:t>The unstructured network may be a chain, a triangle or a larger mesh, and edges can disappear while a wave is in flight. The echo wave converges on any connected graph, uses only local knowledge, and does not require a global clock or a ring order. It also lets each node contribute its JAC, which is the Assignment 1 load-balancing metric. The cost is O(E) messages per wave, acceptable for the assignment scale. After the winner is known, a majority lease keeps it honest: QuorumMonitor probes ready workers with WorkerControlService.GetStatus every second, renews a 2.5-second lease, and forces the leader to step down after two failed checks. A leader that cannot reach a majority cannot accept new work, which prevents two disconnected minorities from both serving clients.</w:t>
+        <w:t>The unstructured network may be a chain, a triangle or a larger mesh, and edges can disappear while a wave is in flight. The echo wave converges on any connected graph, uses only local knowledge, and needs no global clock or ring order. It also lets every node contribute its JAC. The cost is O(E) messages per wave, acceptable at assignment scale, and the same exchange supplies the voter set used for the majority check.</w:t>
       </w:r>
     </w:p>
     <w:p>
@@ -1757,199 +2005,7 @@
         <w:jc w:val="both"/>
       </w:pPr>
       <w:r>
-        <w:t>CoordinatorHealthMonitor sends a bounded FailoverService.Heartbeat to the current coordinator. The health rule has three states:</w:t>
-      </w:r>
-    </w:p>
-    <w:p>
-      <w:pPr>
-        <w:pStyle w:val="ListBullet"/>
-        <w:spacing w:after="60"/>
-      </w:pPr>
-      <w:r>
-        <w:t>ALIVE: the heartbeat answered within the slow threshold (400 ms).</w:t>
-      </w:r>
-    </w:p>
-    <w:p>
-      <w:pPr>
-        <w:pStyle w:val="ListBullet"/>
-        <w:spacing w:after="60"/>
-      </w:pPr>
-      <w:r>
-        <w:t>SUSPECT: the heartbeat answered, but took longer than 400 ms. The peer is demonstrably up, so this does not start an election; it only raises suspicion.</w:t>
-      </w:r>
-    </w:p>
-    <w:p>
-      <w:pPr>
-        <w:pStyle w:val="ListBullet"/>
-        <w:spacing w:after="60"/>
-      </w:pPr>
-      <w:r>
-        <w:t>FAILED: three consecutive probes were missed, or there has been no successful probe for eight seconds. At that point FailureGate admits one failover request for this failure window, suppressing a wave per survivor.</w:t>
-      </w:r>
-    </w:p>
-    <w:p>
-      <w:pPr>
-        <w:spacing w:after="120"/>
-        <w:jc w:val="both"/>
-      </w:pPr>
-      <w:r>
-        <w:t>The per-call deadline is 600 ms and the interval is 1000 ms, so a probe cannot overlap the next one indefinitely. A timeout is only one miss; the threshold of three tolerates a GC pause or a transient scheduler delay. The eight-second silence rule prevents an earlier success from masking a peer that has stopped answering mid-window. These constants are in shared/src/main/java/com/cs324/common/Constants.java and are covered by CoordinatorHealthTest and CoordinatorFailoverTest.</w:t>
-      </w:r>
-    </w:p>
-    <w:p>
-      <w:pPr>
-        <w:spacing w:after="120"/>
-        <w:jc w:val="both"/>
-      </w:pPr>
-      <w:r>
-        <w:t>A coordinator also has to prove that it still has a majority. QuorumMonitor probes each ready worker's WorkerControlService.GetStatus every second with a 600 ms deadline. Self and each reachable member count as a vote; the threshold is floor(n/2)+1. A successful check renews a 2.5-second lease. Two consecutive failed checks clear the coordinator view and record QUORUM_LOST and LEADERSHIP_STEP_DOWN. New admissions require a fresh lease, so a leader that has just lost contact cannot keep serving while a replacement is elected.</w:t>
-      </w:r>
-    </w:p>
-    <w:p>
-      <w:pPr>
-        <w:pStyle w:val="Heading2"/>
-      </w:pPr>
-      <w:r>
-        <w:t>Worker failure during a job</w:t>
-      </w:r>
-    </w:p>
-    <w:p>
-      <w:pPr>
-        <w:spacing w:after="120"/>
-        <w:jc w:val="both"/>
-      </w:pPr>
-      <w:r>
-        <w:t>The coordinator probes outstanding assignments every 500 ms with a one-second timeout. If a worker is unreachable, its unfinished slices are reassigned through fresh discovery, including to a late-joining worker. Each slice has a stable task ID and an attempt number; the assignment key is (job ID, task ID, attempt). A stale result from the old owner cannot complete a replacement attempt, and a completed slice is retained and included once in the aggregate. A failed worker can therefore lose work without failing the job. The progress stream preserves units that the worker had already completed and changes only that worker's status to Failed.</w:t>
-      </w:r>
-    </w:p>
-    <w:p>
-      <w:pPr>
-        <w:pStyle w:val="Heading2"/>
-      </w:pPr>
-      <w:r>
-        <w:t>Slow versus failed</w:t>
-      </w:r>
-    </w:p>
-    <w:p>
-      <w:pPr>
-        <w:spacing w:after="120"/>
-        <w:jc w:val="both"/>
-      </w:pPr>
-      <w:r>
-        <w:t>A successful but slow heartbeat is a SUSPECT signal, not a failure. The distinction matters because a false failure triggers an unnecessary election and can split work. The failure threshold and the quorum lease are intentionally longer than one RPC deadline, but short enough to demonstrate recovery in seconds. A genuinely crashed process stops answering entirely and eventually crosses both the miss threshold and the silence bound. TCP errors are treated as failures immediately; a timeout is treated as a miss until the threshold is reached. The tests exercise both slow and dead coordinators, minority partitions and leader step-down.</w:t>
-      </w:r>
-    </w:p>
-    <w:p>
-      <w:r>
-        <w:br w:type="page"/>
-      </w:r>
-    </w:p>
-    <w:p>
-      <w:pPr>
-        <w:pStyle w:val="Heading1"/>
-      </w:pPr>
-      <w:r>
-        <w:t>Q4. Coordinator failure and state recovery</w:t>
-      </w:r>
-    </w:p>
-    <w:p>
-      <w:pPr>
-        <w:spacing w:after="120"/>
-        <w:jc w:val="both"/>
-      </w:pPr>
-      <w:r>
-        <w:t>A coordinator is not allowed to acknowledge a job until at least one peer has confirmed the acceptance snapshot. The snapshot contains the original SubmitJobRequest, the client callback endpoint, the acceptance time, and every slice with its input, owner and attempt. The coordinator sends it to published peers over FailoverService.Replicate and waits up to one second for an acknowledgement whose sequence covers the snapshot. No peer, a timeout or an RPC error is not confirmation: the submission returns retryable UNAVAILABLE, no computation starts, and the reserved job-budget slot is released. At least two live workers are therefore needed to accept new work.</w:t>
-      </w:r>
-    </w:p>
-    <w:p>
-      <w:pPr>
-        <w:pStyle w:val="Heading2"/>
-      </w:pPr>
-      <w:r>
-        <w:t>Replicated checkpoint log</w:t>
-      </w:r>
-    </w:p>
-    <w:p>
-      <w:pPr>
-        <w:spacing w:after="120"/>
-        <w:jc w:val="both"/>
-      </w:pPr>
-      <w:r>
-        <w:t>Each checkpoint entry has a job ID, a per-job sequence, the producing term and coordinator ID, and one of three payloads: JobAccepted, SliceUpdated or JobFinished. Per-job sequence numbers make folding idempotent: a duplicate or out-of-order entry is ignored instead of applied twice. Every outbound push carries a cumulative snapshot, so an older asynchronous RPC cannot overwrite a newer view. A JobFinished entry is a tombstone: it carries the final result (not one slice's result) and a delivered flag, so a recovered job is not rebuilt and a lost client callback can be replayed. Finished state has a bounded retention window so a long-lived replica does not grow forever.</w:t>
-      </w:r>
-    </w:p>
-    <w:p>
-      <w:pPr>
-        <w:spacing w:after="120"/>
-        <w:jc w:val="both"/>
-      </w:pPr>
-      <w:r>
-        <w:t>The checkpoint log is in memory on every worker. Acceptance is synchronous with one peer acknowledgement; later slice, completion and delivery updates are asynchronous. That is a deliberate trade-off between latency and durability. The system is not a disk-backed Raft/Paxos log: if every replica is lost, or the whole cluster is restarted, the checkpoints are lost. The report states this limitation rather than claiming exactly-once durability.</w:t>
-      </w:r>
-    </w:p>
-    <w:p>
-      <w:pPr>
-        <w:pStyle w:val="Heading2"/>
-      </w:pPr>
-      <w:r>
-        <w:t>Takeover</w:t>
-      </w:r>
-    </w:p>
-    <w:p>
-      <w:pPr>
-        <w:spacing w:after="120"/>
-        <w:jc w:val="both"/>
-      </w:pPr>
-      <w:r>
-        <w:t>When a worker becomes coordinator, it temporarily refuses new jobs. It fetches checkpoint snapshots from every reachable peer and merges them per job, keeping the newest sequence for each job. It does not steal a job that is owned by a live coordinator. For a job whose owner failed, it preserves completed slices and resumes unfinished slices with fresh discovery. The restored job keeps its original deadline, subject to a minimum recovery window so a job that was nearly out of time still gets a fair chance. If every slice is already complete, the job aggregates immediately instead of waiting for a timeout. If the job had already finished, the saved aggregate is delivered; delivery is recorded only after the client callback acknowledges it.</w:t>
-      </w:r>
-    </w:p>
-    <w:p>
-      <w:pPr>
-        <w:spacing w:after="120"/>
-        <w:jc w:val="both"/>
-      </w:pPr>
-      <w:r>
-        <w:t>Recovery has two explicit limits. First, it needs a surviving replica and a reachable replacement coordinator; a two-worker cluster cannot recover from the coordinator's failure because there is no majority left. Second, callback delivery is at-least-once in the presence of lost acknowledgements, so the client deduplicates by job ID. These limits are documented in docs/failover.md and are visible in the process-level GrpcOnlyClusterTest, which terminates a real coordinator and checks the recovered answer and completed progress.</w:t>
-      </w:r>
-    </w:p>
-    <w:p>
-      <w:pPr>
-        <w:pStyle w:val="Heading2"/>
-      </w:pPr>
-      <w:r>
-        <w:t>Bootstrap state and membership</w:t>
-      </w:r>
-    </w:p>
-    <w:p>
-      <w:pPr>
-        <w:spacing w:after="120"/>
-        <w:jc w:val="both"/>
-      </w:pPr>
-      <w:r>
-        <w:t>The bootstrap is still a single directory with no failover replica, but it no longer retains crashed workers forever. Workers refresh their membership entry every five seconds, and the bootstrap reaps an entry after fifteen seconds of silence. That keeps the majority denominator honest. Worker and job ID counters are persisted in bootstrap-state.properties (override with --state-file) so a bootstrap restart does not immediately reuse an identity. Active membership is not persisted: after a bootstrap restart, workers must re-register, and the documented safe procedure is to restart the whole cluster if the old membership is gone.</w:t>
-      </w:r>
-    </w:p>
-    <w:p>
-      <w:r>
-        <w:br w:type="page"/>
-      </w:r>
-    </w:p>
-    <w:p>
-      <w:pPr>
-        <w:pStyle w:val="Heading1"/>
-      </w:pPr>
-      <w:r>
-        <w:t>Q5. Alternatives considered and justification</w:t>
-      </w:r>
-    </w:p>
-    <w:p>
-      <w:pPr>
-        <w:spacing w:after="120"/>
-        <w:jc w:val="both"/>
-      </w:pPr>
-      <w:r>
-        <w:t>The assignments constrain the design: a small, unreliable, unstructured network of worker processes, no fixed leader, multiple clients, Java threads and demonstrable recovery. Several designs would satisfy part of that brief; the chosen design is the one with the best balance of correctness, implementation risk and demo latency.</w:t>
+        <w:t>CoordinatorHealthMonitor sends a bounded FailoverService.Heartbeat to the current coordinator. CoordinatorHealth classifies each result without performing I/O:</w:t>
       </w:r>
     </w:p>
     <w:tbl>
@@ -1967,7 +2023,967 @@
       <w:tr>
         <w:tc>
           <w:tcPr>
-            <w:tcW w:type="dxa" w:w="2088"/>
+            <w:tcW w:type="dxa" w:w="1152"/>
+            <w:shd w:fill="D9E2F3"/>
+          </w:tcPr>
+          <w:p>
+            <w:pPr>
+              <w:spacing w:after="40"/>
+            </w:pPr>
+            <w:r/>
+            <w:r>
+              <w:rPr>
+                <w:rFonts w:ascii="Calibri" w:hAnsi="Calibri"/>
+                <w:b/>
+                <w:sz w:val="19"/>
+              </w:rPr>
+              <w:t>State</w:t>
+            </w:r>
+          </w:p>
+        </w:tc>
+        <w:tc>
+          <w:tcPr>
+            <w:tcW w:type="dxa" w:w="4104"/>
+            <w:shd w:fill="D9E2F3"/>
+          </w:tcPr>
+          <w:p>
+            <w:pPr>
+              <w:spacing w:after="40"/>
+            </w:pPr>
+            <w:r/>
+            <w:r>
+              <w:rPr>
+                <w:rFonts w:ascii="Calibri" w:hAnsi="Calibri"/>
+                <w:b/>
+                <w:sz w:val="19"/>
+              </w:rPr>
+              <w:t>Condition</w:t>
+            </w:r>
+          </w:p>
+        </w:tc>
+        <w:tc>
+          <w:tcPr>
+            <w:tcW w:type="dxa" w:w="5040"/>
+            <w:shd w:fill="D9E2F3"/>
+          </w:tcPr>
+          <w:p>
+            <w:pPr>
+              <w:spacing w:after="40"/>
+            </w:pPr>
+            <w:r/>
+            <w:r>
+              <w:rPr>
+                <w:rFonts w:ascii="Calibri" w:hAnsi="Calibri"/>
+                <w:b/>
+                <w:sz w:val="19"/>
+              </w:rPr>
+              <w:t>Response</w:t>
+            </w:r>
+          </w:p>
+        </w:tc>
+      </w:tr>
+      <w:tr>
+        <w:tc>
+          <w:tcPr>
+            <w:tcW w:type="dxa" w:w="1152"/>
+          </w:tcPr>
+          <w:p>
+            <w:pPr>
+              <w:spacing w:after="40"/>
+            </w:pPr>
+            <w:r/>
+            <w:r>
+              <w:rPr>
+                <w:rFonts w:ascii="Calibri" w:hAnsi="Calibri"/>
+                <w:b w:val="0"/>
+                <w:sz w:val="19"/>
+              </w:rPr>
+              <w:t>ALIVE</w:t>
+            </w:r>
+          </w:p>
+        </w:tc>
+        <w:tc>
+          <w:tcPr>
+            <w:tcW w:type="dxa" w:w="4104"/>
+          </w:tcPr>
+          <w:p>
+            <w:pPr>
+              <w:spacing w:after="40"/>
+            </w:pPr>
+            <w:r/>
+            <w:r>
+              <w:rPr>
+                <w:rFonts w:ascii="Calibri" w:hAnsi="Calibri"/>
+                <w:b w:val="0"/>
+                <w:sz w:val="19"/>
+              </w:rPr>
+              <w:t>Successful heartbeat within the 400 ms slow threshold.</w:t>
+            </w:r>
+          </w:p>
+        </w:tc>
+        <w:tc>
+          <w:tcPr>
+            <w:tcW w:type="dxa" w:w="5040"/>
+          </w:tcPr>
+          <w:p>
+            <w:pPr>
+              <w:spacing w:after="40"/>
+            </w:pPr>
+            <w:r/>
+            <w:r>
+              <w:rPr>
+                <w:rFonts w:ascii="Calibri" w:hAnsi="Calibri"/>
+                <w:b w:val="0"/>
+                <w:sz w:val="19"/>
+              </w:rPr>
+              <w:t>Reset the miss counter; keep serving and monitoring.</w:t>
+            </w:r>
+          </w:p>
+        </w:tc>
+      </w:tr>
+      <w:tr>
+        <w:tc>
+          <w:tcPr>
+            <w:tcW w:type="dxa" w:w="1152"/>
+          </w:tcPr>
+          <w:p>
+            <w:pPr>
+              <w:spacing w:after="40"/>
+            </w:pPr>
+            <w:r/>
+            <w:r>
+              <w:rPr>
+                <w:rFonts w:ascii="Calibri" w:hAnsi="Calibri"/>
+                <w:b w:val="0"/>
+                <w:sz w:val="19"/>
+              </w:rPr>
+              <w:t>SUSPECT</w:t>
+            </w:r>
+          </w:p>
+        </w:tc>
+        <w:tc>
+          <w:tcPr>
+            <w:tcW w:type="dxa" w:w="4104"/>
+          </w:tcPr>
+          <w:p>
+            <w:pPr>
+              <w:spacing w:after="40"/>
+            </w:pPr>
+            <w:r/>
+            <w:r>
+              <w:rPr>
+                <w:rFonts w:ascii="Calibri" w:hAnsi="Calibri"/>
+                <w:b w:val="0"/>
+                <w:sz w:val="19"/>
+              </w:rPr>
+              <w:t>Successful but slow heartbeat, or one or two consecutive misses.</w:t>
+            </w:r>
+          </w:p>
+        </w:tc>
+        <w:tc>
+          <w:tcPr>
+            <w:tcW w:type="dxa" w:w="5040"/>
+          </w:tcPr>
+          <w:p>
+            <w:pPr>
+              <w:spacing w:after="40"/>
+            </w:pPr>
+            <w:r/>
+            <w:r>
+              <w:rPr>
+                <w:rFonts w:ascii="Calibri" w:hAnsi="Calibri"/>
+                <w:b w:val="0"/>
+                <w:sz w:val="19"/>
+              </w:rPr>
+              <w:t>Keep monitoring; a slow peer is demonstrably up, so no election starts.</w:t>
+            </w:r>
+          </w:p>
+        </w:tc>
+      </w:tr>
+      <w:tr>
+        <w:tc>
+          <w:tcPr>
+            <w:tcW w:type="dxa" w:w="1152"/>
+          </w:tcPr>
+          <w:p>
+            <w:pPr>
+              <w:spacing w:after="40"/>
+            </w:pPr>
+            <w:r/>
+            <w:r>
+              <w:rPr>
+                <w:rFonts w:ascii="Calibri" w:hAnsi="Calibri"/>
+                <w:b w:val="0"/>
+                <w:sz w:val="19"/>
+              </w:rPr>
+              <w:t>FAILED</w:t>
+            </w:r>
+          </w:p>
+        </w:tc>
+        <w:tc>
+          <w:tcPr>
+            <w:tcW w:type="dxa" w:w="4104"/>
+          </w:tcPr>
+          <w:p>
+            <w:pPr>
+              <w:spacing w:after="40"/>
+            </w:pPr>
+            <w:r/>
+            <w:r>
+              <w:rPr>
+                <w:rFonts w:ascii="Calibri" w:hAnsi="Calibri"/>
+                <w:b w:val="0"/>
+                <w:sz w:val="19"/>
+              </w:rPr>
+              <w:t>Three consecutive misses, or no success for eight seconds.</w:t>
+            </w:r>
+          </w:p>
+        </w:tc>
+        <w:tc>
+          <w:tcPr>
+            <w:tcW w:type="dxa" w:w="5040"/>
+          </w:tcPr>
+          <w:p>
+            <w:pPr>
+              <w:spacing w:after="40"/>
+            </w:pPr>
+            <w:r/>
+            <w:r>
+              <w:rPr>
+                <w:rFonts w:ascii="Calibri" w:hAnsi="Calibri"/>
+                <w:b w:val="0"/>
+                <w:sz w:val="19"/>
+              </w:rPr>
+              <w:t>FailureGate admits one failover request for this failure window, then survivors elect.</w:t>
+            </w:r>
+          </w:p>
+        </w:tc>
+      </w:tr>
+    </w:tbl>
+    <w:p>
+      <w:pPr>
+        <w:spacing w:after="40"/>
+      </w:pPr>
+    </w:p>
+    <w:p>
+      <w:pPr>
+        <w:spacing w:after="120"/>
+        <w:jc w:val="both"/>
+      </w:pPr>
+      <w:r>
+        <w:t>The per-call deadline is 600 ms and the interval is 1000 ms, so a probe cannot overlap the next one indefinitely. A timeout is only one miss; the threshold of three tolerates a GC pause or a transient scheduler delay. The eight-second silence rule prevents an earlier success from masking a peer that has stopped answering mid-window. These constants are in Constants.java and are covered by CoordinatorHealthTest and CoordinatorFailoverTest.</w:t>
+      </w:r>
+    </w:p>
+    <w:p>
+      <w:pPr>
+        <w:spacing w:after="120"/>
+        <w:jc w:val="both"/>
+      </w:pPr>
+      <w:r>
+        <w:t>A coordinator also has to prove that it still has a majority. QuorumMonitor probes each ready worker's WorkerControlService.GetStatus every second with a 600 ms deadline. Self and each reachable member count as a vote; the threshold is floor(n/2)+1. A successful check renews a 2.5-second lease. Two consecutive failed checks clear the coordinator view and record QUORUM_LOST and LEADERSHIP_STEP_DOWN. New admissions require a fresh lease, so a leader that has just lost contact cannot keep serving while a replacement is elected.</w:t>
+      </w:r>
+    </w:p>
+    <w:p>
+      <w:pPr>
+        <w:pStyle w:val="Heading2"/>
+      </w:pPr>
+      <w:r>
+        <w:t>Worker failure during a job</w:t>
+      </w:r>
+    </w:p>
+    <w:p>
+      <w:pPr>
+        <w:spacing w:after="120"/>
+        <w:jc w:val="both"/>
+      </w:pPr>
+      <w:r>
+        <w:t>The coordinator probes outstanding assignments every 500 ms with a one-second timeout. If a worker is unreachable, its unfinished slices are reassigned through fresh discovery, including to a late-joining worker. Each slice has a stable task ID and an attempt number; the assignment key is (job ID, task ID, attempt). A stale result from the old owner cannot complete a replacement attempt, and a completed slice is retained and included once in the aggregate. A failed worker can therefore lose work without failing the job. The progress stream preserves units that the worker had already completed and changes only that worker's status to Failed.</w:t>
+      </w:r>
+    </w:p>
+    <w:p>
+      <w:pPr>
+        <w:pStyle w:val="Heading2"/>
+      </w:pPr>
+      <w:r>
+        <w:t>Slow versus failed</w:t>
+      </w:r>
+    </w:p>
+    <w:p>
+      <w:pPr>
+        <w:spacing w:after="120"/>
+        <w:jc w:val="both"/>
+      </w:pPr>
+      <w:r>
+        <w:t>A successful but slow heartbeat is a SUSPECT signal, not a failure. The distinction matters because a false failure triggers an unnecessary election and can split work. The failure threshold and the quorum lease are intentionally longer than one RPC deadline, but short enough to demonstrate recovery in seconds. A genuinely crashed process stops answering entirely and eventually crosses both the miss threshold and the silence bound. TCP errors are treated as failures immediately; a timeout is treated as a miss until the threshold is reached. The tests exercise both slow and dead coordinators, minority partitions and leader step-down.</w:t>
+      </w:r>
+    </w:p>
+    <w:p>
+      <w:r>
+        <w:br w:type="page"/>
+      </w:r>
+    </w:p>
+    <w:p>
+      <w:pPr>
+        <w:pStyle w:val="Heading1"/>
+      </w:pPr>
+      <w:r>
+        <w:t>Q4. Coordinator failure and state recovery</w:t>
+      </w:r>
+    </w:p>
+    <w:p>
+      <w:pPr>
+        <w:spacing w:after="120"/>
+        <w:jc w:val="both"/>
+      </w:pPr>
+      <w:r>
+        <w:t>A coordinator is not allowed to acknowledge a job until at least one peer has confirmed the acceptance snapshot. The snapshot contains the original SubmitJobRequest, the client callback endpoint, the acceptance time, and every slice with its input, owner and attempt. The coordinator sends it to published peers over FailoverService.Replicate and waits up to one second for an acknowledgement whose sequence covers the snapshot. No peer, a timeout or an RPC error is not confirmation: the submission returns retryable UNAVAILABLE, no computation starts, and the reserved job-budget slot is released. At least two live workers are therefore needed to accept new work.</w:t>
+      </w:r>
+    </w:p>
+    <w:p>
+      <w:pPr>
+        <w:pStyle w:val="Heading2"/>
+      </w:pPr>
+      <w:r>
+        <w:t>State recovered after a takeover</w:t>
+      </w:r>
+    </w:p>
+    <w:tbl>
+      <w:tblPr>
+        <w:tblStyle w:val="TableGrid"/>
+        <w:tblW w:type="auto" w:w="0"/>
+        <w:jc w:val="center"/>
+        <w:tblLook w:firstColumn="1" w:firstRow="1" w:lastColumn="0" w:lastRow="0" w:noHBand="0" w:noVBand="1" w:val="04A0"/>
+      </w:tblPr>
+      <w:tblGrid>
+        <w:gridCol w:w="3168"/>
+        <w:gridCol w:w="3168"/>
+        <w:gridCol w:w="3168"/>
+      </w:tblGrid>
+      <w:tr>
+        <w:tc>
+          <w:tcPr>
+            <w:tcW w:type="dxa" w:w="1512"/>
+            <w:shd w:fill="D9E2F3"/>
+          </w:tcPr>
+          <w:p>
+            <w:pPr>
+              <w:spacing w:after="40"/>
+            </w:pPr>
+            <w:r/>
+            <w:r>
+              <w:rPr>
+                <w:rFonts w:ascii="Calibri" w:hAnsi="Calibri"/>
+                <w:b/>
+                <w:sz w:val="19"/>
+              </w:rPr>
+              <w:t>State</w:t>
+            </w:r>
+          </w:p>
+        </w:tc>
+        <w:tc>
+          <w:tcPr>
+            <w:tcW w:type="dxa" w:w="4464"/>
+            <w:shd w:fill="D9E2F3"/>
+          </w:tcPr>
+          <w:p>
+            <w:pPr>
+              <w:spacing w:after="40"/>
+            </w:pPr>
+            <w:r/>
+            <w:r>
+              <w:rPr>
+                <w:rFonts w:ascii="Calibri" w:hAnsi="Calibri"/>
+                <w:b/>
+                <w:sz w:val="19"/>
+              </w:rPr>
+              <w:t>What the checkpoint keeps</w:t>
+            </w:r>
+          </w:p>
+        </w:tc>
+        <w:tc>
+          <w:tcPr>
+            <w:tcW w:type="dxa" w:w="4320"/>
+            <w:shd w:fill="D9E2F3"/>
+          </w:tcPr>
+          <w:p>
+            <w:pPr>
+              <w:spacing w:after="40"/>
+            </w:pPr>
+            <w:r/>
+            <w:r>
+              <w:rPr>
+                <w:rFonts w:ascii="Calibri" w:hAnsi="Calibri"/>
+                <w:b/>
+                <w:sz w:val="19"/>
+              </w:rPr>
+              <w:t>Why it matters</w:t>
+            </w:r>
+          </w:p>
+        </w:tc>
+      </w:tr>
+      <w:tr>
+        <w:tc>
+          <w:tcPr>
+            <w:tcW w:type="dxa" w:w="1512"/>
+          </w:tcPr>
+          <w:p>
+            <w:pPr>
+              <w:spacing w:after="40"/>
+            </w:pPr>
+            <w:r/>
+            <w:r>
+              <w:rPr>
+                <w:rFonts w:ascii="Calibri" w:hAnsi="Calibri"/>
+                <w:b w:val="0"/>
+                <w:sz w:val="19"/>
+              </w:rPr>
+              <w:t>Job record</w:t>
+            </w:r>
+          </w:p>
+        </w:tc>
+        <w:tc>
+          <w:tcPr>
+            <w:tcW w:type="dxa" w:w="4464"/>
+          </w:tcPr>
+          <w:p>
+            <w:pPr>
+              <w:spacing w:after="40"/>
+            </w:pPr>
+            <w:r/>
+            <w:r>
+              <w:rPr>
+                <w:rFonts w:ascii="Calibri" w:hAnsi="Calibri"/>
+                <w:b w:val="0"/>
+                <w:sz w:val="19"/>
+              </w:rPr>
+              <w:t>Job ID, computation type, original request and client endpoint.</w:t>
+            </w:r>
+          </w:p>
+        </w:tc>
+        <w:tc>
+          <w:tcPr>
+            <w:tcW w:type="dxa" w:w="4320"/>
+          </w:tcPr>
+          <w:p>
+            <w:pPr>
+              <w:spacing w:after="40"/>
+            </w:pPr>
+            <w:r/>
+            <w:r>
+              <w:rPr>
+                <w:rFonts w:ascii="Calibri" w:hAnsi="Calibri"/>
+                <w:b w:val="0"/>
+                <w:sz w:val="19"/>
+              </w:rPr>
+              <w:t>Rebuild the submission without asking the client to resend it.</w:t>
+            </w:r>
+          </w:p>
+        </w:tc>
+      </w:tr>
+      <w:tr>
+        <w:tc>
+          <w:tcPr>
+            <w:tcW w:type="dxa" w:w="1512"/>
+          </w:tcPr>
+          <w:p>
+            <w:pPr>
+              <w:spacing w:after="40"/>
+            </w:pPr>
+            <w:r/>
+            <w:r>
+              <w:rPr>
+                <w:rFonts w:ascii="Calibri" w:hAnsi="Calibri"/>
+                <w:b w:val="0"/>
+                <w:sz w:val="19"/>
+              </w:rPr>
+              <w:t>Task slices</w:t>
+            </w:r>
+          </w:p>
+        </w:tc>
+        <w:tc>
+          <w:tcPr>
+            <w:tcW w:type="dxa" w:w="4464"/>
+          </w:tcPr>
+          <w:p>
+            <w:pPr>
+              <w:spacing w:after="40"/>
+            </w:pPr>
+            <w:r/>
+            <w:r>
+              <w:rPr>
+                <w:rFonts w:ascii="Calibri" w:hAnsi="Calibri"/>
+                <w:b w:val="0"/>
+                <w:sz w:val="19"/>
+              </w:rPr>
+              <w:t>Task ID, payload, assigned worker and attempt number.</w:t>
+            </w:r>
+          </w:p>
+        </w:tc>
+        <w:tc>
+          <w:tcPr>
+            <w:tcW w:type="dxa" w:w="4320"/>
+          </w:tcPr>
+          <w:p>
+            <w:pPr>
+              <w:spacing w:after="40"/>
+            </w:pPr>
+            <w:r/>
+            <w:r>
+              <w:rPr>
+                <w:rFonts w:ascii="Calibri" w:hAnsi="Calibri"/>
+                <w:b w:val="0"/>
+                <w:sz w:val="19"/>
+              </w:rPr>
+              <w:t>Preserve completed work and identify what must be reassigned.</w:t>
+            </w:r>
+          </w:p>
+        </w:tc>
+      </w:tr>
+      <w:tr>
+        <w:tc>
+          <w:tcPr>
+            <w:tcW w:type="dxa" w:w="1512"/>
+          </w:tcPr>
+          <w:p>
+            <w:pPr>
+              <w:spacing w:after="40"/>
+            </w:pPr>
+            <w:r/>
+            <w:r>
+              <w:rPr>
+                <w:rFonts w:ascii="Calibri" w:hAnsi="Calibri"/>
+                <w:b w:val="0"/>
+                <w:sz w:val="19"/>
+              </w:rPr>
+              <w:t>Execution result</w:t>
+            </w:r>
+          </w:p>
+        </w:tc>
+        <w:tc>
+          <w:tcPr>
+            <w:tcW w:type="dxa" w:w="4464"/>
+          </w:tcPr>
+          <w:p>
+            <w:pPr>
+              <w:spacing w:after="40"/>
+            </w:pPr>
+            <w:r/>
+            <w:r>
+              <w:rPr>
+                <w:rFonts w:ascii="Calibri" w:hAnsi="Calibri"/>
+                <w:b w:val="0"/>
+                <w:sz w:val="19"/>
+              </w:rPr>
+              <w:t>Per-slice result and the attempt that produced it.</w:t>
+            </w:r>
+          </w:p>
+        </w:tc>
+        <w:tc>
+          <w:tcPr>
+            <w:tcW w:type="dxa" w:w="4320"/>
+          </w:tcPr>
+          <w:p>
+            <w:pPr>
+              <w:spacing w:after="40"/>
+            </w:pPr>
+            <w:r/>
+            <w:r>
+              <w:rPr>
+                <w:rFonts w:ascii="Calibri" w:hAnsi="Calibri"/>
+                <w:b w:val="0"/>
+                <w:sz w:val="19"/>
+              </w:rPr>
+              <w:t>Retain useful work and reject late results from an older attempt.</w:t>
+            </w:r>
+          </w:p>
+        </w:tc>
+      </w:tr>
+      <w:tr>
+        <w:tc>
+          <w:tcPr>
+            <w:tcW w:type="dxa" w:w="1512"/>
+          </w:tcPr>
+          <w:p>
+            <w:pPr>
+              <w:spacing w:after="40"/>
+            </w:pPr>
+            <w:r/>
+            <w:r>
+              <w:rPr>
+                <w:rFonts w:ascii="Calibri" w:hAnsi="Calibri"/>
+                <w:b w:val="0"/>
+                <w:sz w:val="19"/>
+              </w:rPr>
+              <w:t>Job outcome</w:t>
+            </w:r>
+          </w:p>
+        </w:tc>
+        <w:tc>
+          <w:tcPr>
+            <w:tcW w:type="dxa" w:w="4464"/>
+          </w:tcPr>
+          <w:p>
+            <w:pPr>
+              <w:spacing w:after="40"/>
+            </w:pPr>
+            <w:r/>
+            <w:r>
+              <w:rPr>
+                <w:rFonts w:ascii="Calibri" w:hAnsi="Calibri"/>
+                <w:b w:val="0"/>
+                <w:sz w:val="19"/>
+              </w:rPr>
+              <w:t>Final aggregate and a client-delivery flag.</w:t>
+            </w:r>
+          </w:p>
+        </w:tc>
+        <w:tc>
+          <w:tcPr>
+            <w:tcW w:type="dxa" w:w="4320"/>
+          </w:tcPr>
+          <w:p>
+            <w:pPr>
+              <w:spacing w:after="40"/>
+            </w:pPr>
+            <w:r/>
+            <w:r>
+              <w:rPr>
+                <w:rFonts w:ascii="Calibri" w:hAnsi="Calibri"/>
+                <w:b w:val="0"/>
+                <w:sz w:val="19"/>
+              </w:rPr>
+              <w:t>Avoid recomputation and resend a result whose callback was not acknowledged.</w:t>
+            </w:r>
+          </w:p>
+        </w:tc>
+      </w:tr>
+      <w:tr>
+        <w:tc>
+          <w:tcPr>
+            <w:tcW w:type="dxa" w:w="1512"/>
+          </w:tcPr>
+          <w:p>
+            <w:pPr>
+              <w:spacing w:after="40"/>
+            </w:pPr>
+            <w:r/>
+            <w:r>
+              <w:rPr>
+                <w:rFonts w:ascii="Calibri" w:hAnsi="Calibri"/>
+                <w:b w:val="0"/>
+                <w:sz w:val="19"/>
+              </w:rPr>
+              <w:t>Timing</w:t>
+            </w:r>
+          </w:p>
+        </w:tc>
+        <w:tc>
+          <w:tcPr>
+            <w:tcW w:type="dxa" w:w="4464"/>
+          </w:tcPr>
+          <w:p>
+            <w:pPr>
+              <w:spacing w:after="40"/>
+            </w:pPr>
+            <w:r/>
+            <w:r>
+              <w:rPr>
+                <w:rFonts w:ascii="Calibri" w:hAnsi="Calibri"/>
+                <w:b w:val="0"/>
+                <w:sz w:val="19"/>
+              </w:rPr>
+              <w:t>Original acceptance timestamp and remaining budget.</w:t>
+            </w:r>
+          </w:p>
+        </w:tc>
+        <w:tc>
+          <w:tcPr>
+            <w:tcW w:type="dxa" w:w="4320"/>
+          </w:tcPr>
+          <w:p>
+            <w:pPr>
+              <w:spacing w:after="40"/>
+            </w:pPr>
+            <w:r/>
+            <w:r>
+              <w:rPr>
+                <w:rFonts w:ascii="Calibri" w:hAnsi="Calibri"/>
+                <w:b w:val="0"/>
+                <w:sz w:val="19"/>
+              </w:rPr>
+              <w:t>Reconstruct the deadline, with a minimum recovery allowance.</w:t>
+            </w:r>
+          </w:p>
+        </w:tc>
+      </w:tr>
+      <w:tr>
+        <w:tc>
+          <w:tcPr>
+            <w:tcW w:type="dxa" w:w="1512"/>
+          </w:tcPr>
+          <w:p>
+            <w:pPr>
+              <w:spacing w:after="40"/>
+            </w:pPr>
+            <w:r/>
+            <w:r>
+              <w:rPr>
+                <w:rFonts w:ascii="Calibri" w:hAnsi="Calibri"/>
+                <w:b w:val="0"/>
+                <w:sz w:val="19"/>
+              </w:rPr>
+              <w:t>Ordering metadata</w:t>
+            </w:r>
+          </w:p>
+        </w:tc>
+        <w:tc>
+          <w:tcPr>
+            <w:tcW w:type="dxa" w:w="4464"/>
+          </w:tcPr>
+          <w:p>
+            <w:pPr>
+              <w:spacing w:after="40"/>
+            </w:pPr>
+            <w:r/>
+            <w:r>
+              <w:rPr>
+                <w:rFonts w:ascii="Calibri" w:hAnsi="Calibri"/>
+                <w:b w:val="0"/>
+                <w:sz w:val="19"/>
+              </w:rPr>
+              <w:t>Per-job sequence, leadership term and coordinator ID.</w:t>
+            </w:r>
+          </w:p>
+        </w:tc>
+        <w:tc>
+          <w:tcPr>
+            <w:tcW w:type="dxa" w:w="4320"/>
+          </w:tcPr>
+          <w:p>
+            <w:pPr>
+              <w:spacing w:after="40"/>
+            </w:pPr>
+            <w:r/>
+            <w:r>
+              <w:rPr>
+                <w:rFonts w:ascii="Calibri" w:hAnsi="Calibri"/>
+                <w:b w:val="0"/>
+                <w:sz w:val="19"/>
+              </w:rPr>
+              <w:t>Fold updates idempotently and reject stale or duplicate state.</w:t>
+            </w:r>
+          </w:p>
+        </w:tc>
+      </w:tr>
+    </w:tbl>
+    <w:p>
+      <w:pPr>
+        <w:spacing w:after="40"/>
+      </w:pPr>
+    </w:p>
+    <w:p>
+      <w:pPr>
+        <w:pStyle w:val="Heading2"/>
+      </w:pPr>
+      <w:r>
+        <w:t>Replicated checkpoint log</w:t>
+      </w:r>
+    </w:p>
+    <w:p>
+      <w:pPr>
+        <w:spacing w:after="120"/>
+        <w:jc w:val="both"/>
+      </w:pPr>
+      <w:r>
+        <w:t>Each checkpoint entry has a job ID, a per-job sequence, the producing term and coordinator ID, and one of three payloads: JobAccepted, SliceUpdated or JobFinished. Per-job sequence numbers make folding idempotent: a duplicate or out-of-order entry is ignored instead of applied twice. Every outbound push carries a cumulative snapshot, so an older asynchronous RPC cannot overwrite a newer view. A JobFinished entry is a tombstone: it carries the final result (not one slice's result) and a delivered flag, so a recovered job is not rebuilt and a lost client callback can be replayed. Finished state has a bounded retention window so a long-lived replica does not grow forever.</w:t>
+      </w:r>
+    </w:p>
+    <w:p>
+      <w:pPr>
+        <w:spacing w:after="120"/>
+        <w:jc w:val="both"/>
+      </w:pPr>
+      <w:r>
+        <w:t>The checkpoint log is in memory on every worker. Acceptance is synchronous with one peer acknowledgement; later slice, completion and delivery updates are asynchronous. That is a deliberate trade-off between latency and durability. The system is not a disk-backed Raft/Paxos log: if every replica is lost, or the whole cluster is restarted, the checkpoints are lost. The report states this limitation rather than claiming exactly-once durability.</w:t>
+      </w:r>
+    </w:p>
+    <w:p>
+      <w:pPr>
+        <w:pStyle w:val="Heading2"/>
+      </w:pPr>
+      <w:r>
+        <w:t>Takeover</w:t>
+      </w:r>
+    </w:p>
+    <w:p>
+      <w:pPr>
+        <w:spacing w:after="120"/>
+        <w:jc w:val="both"/>
+      </w:pPr>
+      <w:r>
+        <w:t>When a worker becomes coordinator, it temporarily refuses new jobs. It fetches checkpoint snapshots from every reachable peer and merges them per job, keeping the newest sequence for each job. It does not steal a job that is owned by a live coordinator. For a job whose owner failed, it preserves completed slices and resumes unfinished slices with fresh discovery. The restored job keeps its original deadline, subject to a minimum recovery window so a job that was nearly out of time still gets a fair chance. If every slice is already complete, the job aggregates immediately instead of waiting for a timeout. If the job had already finished, the saved aggregate is delivered; delivery is recorded only after the client callback acknowledges it.</w:t>
+      </w:r>
+    </w:p>
+    <w:p>
+      <w:pPr>
+        <w:spacing w:after="120"/>
+        <w:jc w:val="both"/>
+      </w:pPr>
+      <w:r>
+        <w:t>Recovery has two explicit limits. First, it needs a surviving replica and a reachable replacement coordinator; a two-worker cluster cannot recover from the coordinator's failure because there is no majority left. Second, callback delivery is at-least-once in the presence of lost acknowledgements, so the client deduplicates by job ID. These limits are documented in docs/failover.md and are visible in the process-level GrpcOnlyClusterTest, which terminates a real coordinator and checks the recovered answer and completed progress.</w:t>
+      </w:r>
+    </w:p>
+    <w:p>
+      <w:pPr>
+        <w:pStyle w:val="Heading2"/>
+      </w:pPr>
+      <w:r>
+        <w:t>Bootstrap state and membership</w:t>
+      </w:r>
+    </w:p>
+    <w:p>
+      <w:pPr>
+        <w:spacing w:after="120"/>
+        <w:jc w:val="both"/>
+      </w:pPr>
+      <w:r>
+        <w:t>The bootstrap is still a single directory with no failover replica, but it no longer retains crashed workers forever. Workers refresh their membership entry every five seconds, and the bootstrap reaps an entry after fifteen seconds of silence. That keeps the majority denominator honest. Worker and job ID counters are persisted in bootstrap-state.properties (override with --state-file) so a bootstrap restart does not immediately reuse an identity. Active membership is not persisted: after a bootstrap restart, workers must re-register, and the documented safe procedure is to restart the whole cluster if the old membership is gone.</w:t>
+      </w:r>
+    </w:p>
+    <w:p>
+      <w:r>
+        <w:br w:type="page"/>
+      </w:r>
+    </w:p>
+    <w:p>
+      <w:pPr>
+        <w:pStyle w:val="Heading1"/>
+      </w:pPr>
+      <w:r>
+        <w:t>Q5. Overall failure detection and recovery strategies</w:t>
+      </w:r>
+    </w:p>
+    <w:p>
+      <w:pPr>
+        <w:spacing w:after="120"/>
+        <w:jc w:val="both"/>
+      </w:pPr>
+      <w:r>
+        <w:t>DistriLab combines five mechanisms because each addresses a different failure: unreachability, conflicting leadership, lost work, stale messages and a failed client callback. The design targets a small, unreliable, unstructured worker network and must recover without manual restart.</w:t>
+      </w:r>
+    </w:p>
+    <w:p>
+      <w:pPr>
+        <w:pStyle w:val="Heading2"/>
+      </w:pPr>
+      <w:r>
+        <w:t>Selected strategies and justification</w:t>
+      </w:r>
+    </w:p>
+    <w:p>
+      <w:pPr>
+        <w:spacing w:after="120"/>
+        <w:jc w:val="both"/>
+      </w:pPr>
+      <w:r>
+        <w:rPr>
+          <w:b/>
+          <w:color w:val="2E5A88"/>
+        </w:rPr>
+        <w:t xml:space="preserve">Heartbeat monitoring. </w:t>
+      </w:r>
+      <w:r>
+        <w:t>Followers probe the coordinator every 1,000 ms with a 600 ms deadline. A successful response under 400 ms is ALIVE; a slower response or one or two misses is SUSPECT; three misses or eight seconds without success is FAILED. This avoids an election after a single delayed reply, while still detecting a process that has stopped.</w:t>
+      </w:r>
+    </w:p>
+    <w:p>
+      <w:pPr>
+        <w:spacing w:after="120"/>
+        <w:jc w:val="both"/>
+      </w:pPr>
+      <w:r>
+        <w:rPr>
+          <w:b/>
+          <w:color w:val="2E5A88"/>
+        </w:rPr>
+        <w:t xml:space="preserve">Echo-wave election. </w:t>
+      </w:r>
+      <w:r>
+        <w:t>Election messages follow the current neighbour graph and echoes merge each subtree's best candidate and voters. The lowest JAC wins, with the highest worker ID as tie-breaker. The initiator announces only with a strict majority of ready workers, which suits an unstructured overlay better than an ID-ordered Bully or ring.</w:t>
+      </w:r>
+    </w:p>
+    <w:p>
+      <w:pPr>
+        <w:spacing w:after="120"/>
+        <w:jc w:val="both"/>
+      </w:pPr>
+      <w:r>
+        <w:rPr>
+          <w:b/>
+          <w:color w:val="2E5A88"/>
+        </w:rPr>
+        <w:t xml:space="preserve">Majority-quorum protection. </w:t>
+      </w:r>
+      <w:r>
+        <w:t>QuorumMonitor probes ready workers every second, uses a 600 ms deadline, clears the view after two failed checks and renews a 2,500 ms lease. New jobs require a fresh lease. A leader in a minority partition therefore stops accepting work instead of creating conflicting results, prioritising safety over availability.</w:t>
+      </w:r>
+    </w:p>
+    <w:p>
+      <w:pPr>
+        <w:spacing w:after="120"/>
+        <w:jc w:val="both"/>
+      </w:pPr>
+      <w:r>
+        <w:rPr>
+          <w:b/>
+          <w:color w:val="2E5A88"/>
+        </w:rPr>
+        <w:t xml:space="preserve">Replicated checkpoints. </w:t>
+      </w:r>
+      <w:r>
+        <w:t>JobAccepted, SliceUpdated and JobFinished entries are replicated to peers with per-job sequence numbers and terms. At least one peer must confirm acceptance before the client is told the job was accepted. Later updates are asynchronous, which keeps submission responsive but means the newest intermediate update may be lost.</w:t>
+      </w:r>
+    </w:p>
+    <w:p>
+      <w:pPr>
+        <w:spacing w:after="120"/>
+        <w:jc w:val="both"/>
+      </w:pPr>
+      <w:r>
+        <w:rPr>
+          <w:b/>
+          <w:color w:val="2E5A88"/>
+        </w:rPr>
+        <w:t xml:space="preserve">Task reassignment and duplicate control. </w:t>
+      </w:r>
+      <w:r>
+        <w:t>When an owner is unreachable, its unfinished slices are reassigned with an incremented attempt. Stable task IDs and checkpointed results preserve completed units and reject a late result from an older attempt. This is cheaper than restarting the whole job and is safer than accepting the first reply blindly.</w:t>
+      </w:r>
+    </w:p>
+    <w:p>
+      <w:pPr>
+        <w:pStyle w:val="Heading2"/>
+      </w:pPr>
+      <w:r>
+        <w:t>Alternatives considered</w:t>
+      </w:r>
+    </w:p>
+    <w:tbl>
+      <w:tblPr>
+        <w:tblStyle w:val="TableGrid"/>
+        <w:tblW w:type="auto" w:w="0"/>
+        <w:jc w:val="center"/>
+        <w:tblLook w:firstColumn="1" w:firstRow="1" w:lastColumn="0" w:lastRow="0" w:noHBand="0" w:noVBand="1" w:val="04A0"/>
+      </w:tblPr>
+      <w:tblGrid>
+        <w:gridCol w:w="3168"/>
+        <w:gridCol w:w="3168"/>
+        <w:gridCol w:w="3168"/>
+      </w:tblGrid>
+      <w:tr>
+        <w:tc>
+          <w:tcPr>
+            <w:tcW w:type="dxa" w:w="1944"/>
             <w:shd w:fill="D9E2F3"/>
           </w:tcPr>
           <w:p>
@@ -1987,7 +3003,7 @@
         </w:tc>
         <w:tc>
           <w:tcPr>
-            <w:tcW w:type="dxa" w:w="3240"/>
+            <w:tcW w:type="dxa" w:w="3096"/>
             <w:shd w:fill="D9E2F3"/>
           </w:tcPr>
           <w:p>
@@ -2001,13 +3017,13 @@
                 <w:b/>
                 <w:sz w:val="19"/>
               </w:rPr>
-              <w:t>Strengths</w:t>
+              <w:t>Attraction</w:t>
             </w:r>
           </w:p>
         </w:tc>
         <w:tc>
           <w:tcPr>
-            <w:tcW w:type="dxa" w:w="4968"/>
+            <w:tcW w:type="dxa" w:w="5256"/>
             <w:shd w:fill="D9E2F3"/>
           </w:tcPr>
           <w:p>
@@ -2021,7 +3037,7 @@
                 <w:b/>
                 <w:sz w:val="19"/>
               </w:rPr>
-              <w:t>Why it was not chosen / how it influenced the design</w:t>
+              <w:t>Why the chosen design differs</w:t>
             </w:r>
           </w:p>
         </w:tc>
@@ -2029,7 +3045,7 @@
       <w:tr>
         <w:tc>
           <w:tcPr>
-            <w:tcW w:type="dxa" w:w="2088"/>
+            <w:tcW w:type="dxa" w:w="1944"/>
           </w:tcPr>
           <w:p>
             <w:pPr>
@@ -2048,7 +3064,7 @@
         </w:tc>
         <w:tc>
           <w:tcPr>
-            <w:tcW w:type="dxa" w:w="3240"/>
+            <w:tcW w:type="dxa" w:w="3096"/>
           </w:tcPr>
           <w:p>
             <w:pPr>
@@ -2061,13 +3077,13 @@
                 <w:b w:val="0"/>
                 <w:sz w:val="19"/>
               </w:rPr>
-              <w:t>Very simple; no election; easy to test.</w:t>
+              <w:t>No election and simple testing.</w:t>
             </w:r>
           </w:p>
         </w:tc>
         <w:tc>
           <w:tcPr>
-            <w:tcW w:type="dxa" w:w="4968"/>
+            <w:tcW w:type="dxa" w:w="5256"/>
           </w:tcPr>
           <w:p>
             <w:pPr>
@@ -2080,7 +3096,7 @@
                 <w:b w:val="0"/>
                 <w:sz w:val="19"/>
               </w:rPr>
-              <w:t>Single point of failure and does not satisfy leader election. Retained only as the bootstrap directory, which is not the job coordinator.</w:t>
+              <w:t>It is a single point of failure and fails the leader-election requirement. The bootstrap remains only a directory.</w:t>
             </w:r>
           </w:p>
         </w:tc>
@@ -2088,7 +3104,7 @@
       <w:tr>
         <w:tc>
           <w:tcPr>
-            <w:tcW w:type="dxa" w:w="2088"/>
+            <w:tcW w:type="dxa" w:w="1944"/>
           </w:tcPr>
           <w:p>
             <w:pPr>
@@ -2107,7 +3123,7 @@
         </w:tc>
         <w:tc>
           <w:tcPr>
-            <w:tcW w:type="dxa" w:w="3240"/>
+            <w:tcW w:type="dxa" w:w="3096"/>
           </w:tcPr>
           <w:p>
             <w:pPr>
@@ -2120,13 +3136,13 @@
                 <w:b w:val="0"/>
                 <w:sz w:val="19"/>
               </w:rPr>
-              <w:t>Deterministic; low message count on a stable ordered ring.</w:t>
+              <w:t>Deterministic and low message count on an ordered ring.</w:t>
             </w:r>
           </w:p>
         </w:tc>
         <w:tc>
           <w:tcPr>
-            <w:tcW w:type="dxa" w:w="4968"/>
+            <w:tcW w:type="dxa" w:w="5256"/>
           </w:tcPr>
           <w:p>
             <w:pPr>
@@ -2139,7 +3155,7 @@
                 <w:b w:val="0"/>
                 <w:sz w:val="19"/>
               </w:rPr>
-              <w:t>Depends on IDs and a stable order; an unstructured, healing mesh makes ring maintenance and failure handling awkward.</w:t>
+              <w:t>An unstructured, healing mesh has no stable ring, and ID order ignores the JAC load metric.</w:t>
             </w:r>
           </w:p>
         </w:tc>
@@ -2147,7 +3163,7 @@
       <w:tr>
         <w:tc>
           <w:tcPr>
-            <w:tcW w:type="dxa" w:w="2088"/>
+            <w:tcW w:type="dxa" w:w="1944"/>
           </w:tcPr>
           <w:p>
             <w:pPr>
@@ -2160,13 +3176,13 @@
                 <w:b w:val="0"/>
                 <w:sz w:val="19"/>
               </w:rPr>
-              <w:t>Heartbeat + gossip membership</w:t>
+              <w:t>Gossip membership</w:t>
             </w:r>
           </w:p>
         </w:tc>
         <w:tc>
           <w:tcPr>
-            <w:tcW w:type="dxa" w:w="3240"/>
+            <w:tcW w:type="dxa" w:w="3096"/>
           </w:tcPr>
           <w:p>
             <w:pPr>
@@ -2179,13 +3195,13 @@
                 <w:b w:val="0"/>
                 <w:sz w:val="19"/>
               </w:rPr>
-              <w:t>Scales well; eventually consistent; tolerant of churn.</w:t>
+              <w:t>Scales and tolerates churn.</w:t>
             </w:r>
           </w:p>
         </w:tc>
         <w:tc>
           <w:tcPr>
-            <w:tcW w:type="dxa" w:w="4968"/>
+            <w:tcW w:type="dxa" w:w="5256"/>
           </w:tcPr>
           <w:p>
             <w:pPr>
@@ -2198,7 +3214,7 @@
                 <w:b w:val="0"/>
                 <w:sz w:val="19"/>
               </w:rPr>
-              <w:t>Gossip convergence is slower than a bounded heartbeat for a demo, and it still needs a majority rule to avoid split brain. Bounded heartbeats fit this scale.</w:t>
+              <w:t>Convergence is slower for a demo and still needs a majority rule to avoid split brain.</w:t>
             </w:r>
           </w:p>
         </w:tc>
@@ -2206,7 +3222,7 @@
       <w:tr>
         <w:tc>
           <w:tcPr>
-            <w:tcW w:type="dxa" w:w="2088"/>
+            <w:tcW w:type="dxa" w:w="1944"/>
           </w:tcPr>
           <w:p>
             <w:pPr>
@@ -2225,7 +3241,7 @@
         </w:tc>
         <w:tc>
           <w:tcPr>
-            <w:tcW w:type="dxa" w:w="3240"/>
+            <w:tcW w:type="dxa" w:w="3096"/>
           </w:tcPr>
           <w:p>
             <w:pPr>
@@ -2238,13 +3254,13 @@
                 <w:b w:val="0"/>
                 <w:sz w:val="19"/>
               </w:rPr>
-              <w:t>Durable, strongly consistent replicated log; well-understood safety proofs.</w:t>
+              <w:t>Durable, strongly consistent replicated log.</w:t>
             </w:r>
           </w:p>
         </w:tc>
         <w:tc>
           <w:tcPr>
-            <w:tcW w:type="dxa" w:w="4968"/>
+            <w:tcW w:type="dxa" w:w="5256"/>
           </w:tcPr>
           <w:p>
             <w:pPr>
@@ -2257,7 +3273,7 @@
                 <w:b w:val="0"/>
                 <w:sz w:val="19"/>
               </w:rPr>
-              <w:t>Substantially more implementation and test complexity than the assignment requires. The project uses a majority lease plus replicated checkpoints, not a full consensus log.</w:t>
+              <w:t>Much greater implementation and test complexity; the project uses a majority lease and replicated checkpoints, not a consensus library.</w:t>
             </w:r>
           </w:p>
         </w:tc>
@@ -2265,125 +3281,7 @@
       <w:tr>
         <w:tc>
           <w:tcPr>
-            <w:tcW w:type="dxa" w:w="2088"/>
-          </w:tcPr>
-          <w:p>
-            <w:pPr>
-              <w:spacing w:after="40"/>
-            </w:pPr>
-            <w:r/>
-            <w:r>
-              <w:rPr>
-                <w:rFonts w:ascii="Calibri" w:hAnsi="Calibri"/>
-                <w:b w:val="0"/>
-                <w:sz w:val="19"/>
-              </w:rPr>
-              <w:t>Disk WAL / quorum commit</w:t>
-            </w:r>
-          </w:p>
-        </w:tc>
-        <w:tc>
-          <w:tcPr>
-            <w:tcW w:type="dxa" w:w="3240"/>
-          </w:tcPr>
-          <w:p>
-            <w:pPr>
-              <w:spacing w:after="40"/>
-            </w:pPr>
-            <w:r/>
-            <w:r>
-              <w:rPr>
-                <w:rFonts w:ascii="Calibri" w:hAnsi="Calibri"/>
-                <w:b w:val="0"/>
-                <w:sz w:val="19"/>
-              </w:rPr>
-              <w:t>Survives process and machine restarts; stronger durability.</w:t>
-            </w:r>
-          </w:p>
-        </w:tc>
-        <w:tc>
-          <w:tcPr>
-            <w:tcW w:type="dxa" w:w="4968"/>
-          </w:tcPr>
-          <w:p>
-            <w:pPr>
-              <w:spacing w:after="40"/>
-            </w:pPr>
-            <w:r/>
-            <w:r>
-              <w:rPr>
-                <w:rFonts w:ascii="Calibri" w:hAnsi="Calibri"/>
-                <w:b w:val="0"/>
-                <w:sz w:val="19"/>
-              </w:rPr>
-              <w:t>Adds storage, compaction and recovery complexity. The assignment demo is in-memory; the limitation is stated explicitly.</w:t>
-            </w:r>
-          </w:p>
-        </w:tc>
-      </w:tr>
-      <w:tr>
-        <w:tc>
-          <w:tcPr>
-            <w:tcW w:type="dxa" w:w="2088"/>
-          </w:tcPr>
-          <w:p>
-            <w:pPr>
-              <w:spacing w:after="40"/>
-            </w:pPr>
-            <w:r/>
-            <w:r>
-              <w:rPr>
-                <w:rFonts w:ascii="Calibri" w:hAnsi="Calibri"/>
-                <w:b w:val="0"/>
-                <w:sz w:val="19"/>
-              </w:rPr>
-              <w:t>Synchronous replication to every replica</w:t>
-            </w:r>
-          </w:p>
-        </w:tc>
-        <w:tc>
-          <w:tcPr>
-            <w:tcW w:type="dxa" w:w="3240"/>
-          </w:tcPr>
-          <w:p>
-            <w:pPr>
-              <w:spacing w:after="40"/>
-            </w:pPr>
-            <w:r/>
-            <w:r>
-              <w:rPr>
-                <w:rFonts w:ascii="Calibri" w:hAnsi="Calibri"/>
-                <w:b w:val="0"/>
-                <w:sz w:val="19"/>
-              </w:rPr>
-              <w:t>Stronger before-ack durability.</w:t>
-            </w:r>
-          </w:p>
-        </w:tc>
-        <w:tc>
-          <w:tcPr>
-            <w:tcW w:type="dxa" w:w="4968"/>
-          </w:tcPr>
-          <w:p>
-            <w:pPr>
-              <w:spacing w:after="40"/>
-            </w:pPr>
-            <w:r/>
-            <w:r>
-              <w:rPr>
-                <w:rFonts w:ascii="Calibri" w:hAnsi="Calibri"/>
-                <w:b w:val="0"/>
-                <w:sz w:val="19"/>
-              </w:rPr>
-              <w:t>Higher submission latency and lower availability when any replica is slow. One confirmed acknowledgement is the documented compromise.</w:t>
-            </w:r>
-          </w:p>
-        </w:tc>
-      </w:tr>
-      <w:tr>
-        <w:tc>
-          <w:tcPr>
-            <w:tcW w:type="dxa" w:w="2088"/>
+            <w:tcW w:type="dxa" w:w="1944"/>
           </w:tcPr>
           <w:p>
             <w:pPr>
@@ -2402,7 +3300,7 @@
         </w:tc>
         <w:tc>
           <w:tcPr>
-            <w:tcW w:type="dxa" w:w="3240"/>
+            <w:tcW w:type="dxa" w:w="3096"/>
           </w:tcPr>
           <w:p>
             <w:pPr>
@@ -2415,13 +3313,13 @@
                 <w:b w:val="0"/>
                 <w:sz w:val="19"/>
               </w:rPr>
-              <w:t>No streaming API; simple request/response.</w:t>
+              <w:t>No streaming API.</w:t>
             </w:r>
           </w:p>
         </w:tc>
         <w:tc>
           <w:tcPr>
-            <w:tcW w:type="dxa" w:w="4968"/>
+            <w:tcW w:type="dxa" w:w="5256"/>
           </w:tcPr>
           <w:p>
             <w:pPr>
@@ -2434,7 +3332,7 @@
                 <w:b w:val="0"/>
                 <w:sz w:val="19"/>
               </w:rPr>
-              <w:t>Not real-time and produces either stale bars or heavy polling. gRPC server streaming matches the requirement directly.</w:t>
+              <w:t>It is not real-time and causes stale bars or heavy polling; gRPC server streaming fits the requirement.</w:t>
             </w:r>
           </w:p>
         </w:tc>
@@ -2450,34 +3348,136 @@
         <w:pStyle w:val="Heading2"/>
       </w:pPr>
       <w:r>
-        <w:t>Justification</w:t>
+        <w:t>Recovery sequence</w:t>
       </w:r>
     </w:p>
     <w:p>
       <w:pPr>
-        <w:spacing w:after="120"/>
-        <w:jc w:val="both"/>
+        <w:pStyle w:val="ListNumber"/>
+        <w:spacing w:after="60"/>
       </w:pPr>
       <w:r>
-        <w:t>The echo wave plus strict-majority announcement provides leader election on an arbitrary connected graph. The majority lease addresses the failure mode that a simple election alone does not: a leader isolated with a minority must stop serving. The checkpoint design addresses the other failure mode: the coordinator dying with accepted work that only it knew about. Requiring one peer acknowledgement before the client is told the job was accepted is the smallest change that makes the failure window meaningful, while keeping the demo responsive.</w:t>
+        <w:t>Detect an unresponsive worker or coordinator through gRPC deadlines, refused connections and the health state machine.</w:t>
       </w:r>
     </w:p>
     <w:p>
       <w:pPr>
-        <w:spacing w:after="120"/>
-        <w:jc w:val="both"/>
+        <w:pStyle w:val="ListNumber"/>
+        <w:spacing w:after="60"/>
       </w:pPr>
       <w:r>
-        <w:t>Full Raft would give a stronger guarantee, but it would also change the project's centre of gravity from 'distributed worker cluster with election and recovery' to 'implement and verify a consensus library'. The chosen design is honest about its boundary: it has a majority lease, term-based leadership, bounded failure detection and replicated checkpoints, but it is not a durable consensus log. That is a reasonable engineering choice for the assignment scale and is documented for the reader.</w:t>
+        <w:t>For a coordinator failure, start the echo wave and require strict-majority participation before announcing a replacement.</w:t>
       </w:r>
     </w:p>
     <w:p>
       <w:pPr>
+        <w:pStyle w:val="ListNumber"/>
+        <w:spacing w:after="60"/>
+      </w:pPr>
+      <w:r>
+        <w:t>Install the new coordinator with a higher term; reject stale announcements and step down a leader that loses its quorum lease.</w:t>
+      </w:r>
+    </w:p>
+    <w:p>
+      <w:pPr>
+        <w:pStyle w:val="ListNumber"/>
+        <w:spacing w:after="60"/>
+      </w:pPr>
+      <w:r>
+        <w:t>Fetch checkpoint snapshots from reachable peers, merge by job and sequence, and preserve completed slices.</w:t>
+      </w:r>
+    </w:p>
+    <w:p>
+      <w:pPr>
+        <w:pStyle w:val="ListNumber"/>
+        <w:spacing w:after="60"/>
+      </w:pPr>
+      <w:r>
+        <w:t>Reassign unfinished slices from unreachable owners with new attempts; resume progress reporting from recovered state.</w:t>
+      </w:r>
+    </w:p>
+    <w:p>
+      <w:pPr>
+        <w:pStyle w:val="ListNumber"/>
+        <w:spacing w:after="60"/>
+      </w:pPr>
+      <w:r>
+        <w:t>Redeliver a completed result whose client callback was not acknowledged. Delivery is at-least-once, so the client deduplicates by job ID.</w:t>
+      </w:r>
+    </w:p>
+    <w:p>
+      <w:pPr>
+        <w:pStyle w:val="Heading2"/>
+      </w:pPr>
+      <w:r>
+        <w:t>Limitations and conclusion</w:t>
+      </w:r>
+    </w:p>
+    <w:p>
+      <w:pPr>
         <w:spacing w:after="120"/>
         <w:jc w:val="both"/>
       </w:pPr>
       <w:r>
-        <w:t>For a production version, the next steps would be a persistent write-ahead log with quorum commit, TLS and authenticated worker identities, bounded queues with backpressure, and metrics/tracing for failure detection. Those are extensions, not prerequisites for the demonstrated behaviour. The implementation already uses bounded retention for old jobs, tasks, election waves and finished checkpoints, so the in-memory design does not grow without limit during a long demo.</w:t>
+        <w:t>A timeout proves unreachability, not a crash: a slow or isolated process can look failed. Asynchronous replication can omit the last intermediate checkpoint, and a cluster without a majority deliberately rejects new work. Checkpoints are in memory, so losing every replica loses recovery state. The bootstrap is a single directory, and callbacks are at-least-once. These limits are documented in docs/failover.md and are preferable to claiming durability the implementation does not provide.</w:t>
+      </w:r>
+    </w:p>
+    <w:p>
+      <w:pPr>
+        <w:spacing w:after="120"/>
+        <w:jc w:val="both"/>
+      </w:pPr>
+      <w:r>
+        <w:t>The combination is appropriate for the assignment: it elects on an arbitrary graph, prevents a minority leader from serving, preserves accepted work across a coordinator change and recovers unfinished slices without restarting every job. Full Raft would give stronger durability but would replace the assignment's focus with a consensus implementation. Bounded retention for jobs, tasks, election waves and finished checkpoints keeps the in-memory design stable during a long demo.</w:t>
+      </w:r>
+    </w:p>
+    <w:p>
+      <w:r>
+        <w:br w:type="page"/>
+      </w:r>
+    </w:p>
+    <w:p>
+      <w:pPr>
+        <w:pStyle w:val="Heading1"/>
+      </w:pPr>
+      <w:r>
+        <w:t>References</w:t>
+      </w:r>
+    </w:p>
+    <w:p>
+      <w:pPr>
+        <w:spacing w:after="120"/>
+        <w:ind w:left="504" w:hanging="504"/>
+      </w:pPr>
+      <w:r>
+        <w:t>Google. (n.d.). gRPC documentation. https://grpc.io/docs/</w:t>
+      </w:r>
+    </w:p>
+    <w:p>
+      <w:pPr>
+        <w:spacing w:after="120"/>
+        <w:ind w:left="504" w:hanging="504"/>
+      </w:pPr>
+      <w:r>
+        <w:t>Google. (n.d.). Protocol Buffers documentation. https://protobuf.dev/</w:t>
+      </w:r>
+    </w:p>
+    <w:p>
+      <w:pPr>
+        <w:spacing w:after="120"/>
+        <w:ind w:left="504" w:hanging="504"/>
+      </w:pPr>
+      <w:r>
+        <w:t>Oracle. (n.d.). Java Remote Method Invocation (Java RMI). https://docs.oracle.com/javase/8/docs/technotes/guides/rmi/</w:t>
+      </w:r>
+    </w:p>
+    <w:p>
+      <w:pPr>
+        <w:spacing w:after="120"/>
+        <w:ind w:left="504" w:hanging="504"/>
+      </w:pPr>
+      <w:r>
+        <w:t>Van Steen, M., &amp; Tanenbaum, A. S. (2025). Distributed systems (4th ed., Version 4.03). Sections 4.2 and 5.4; Chapters 7 and 8.</w:t>
       </w:r>
     </w:p>
     <w:p>

</xml_diff>